<commit_message>
add github link in word file
</commit_message>
<xml_diff>
--- a/Περιεχόμενα.docx
+++ b/Περιεχόμενα.docx
@@ -809,6 +809,7 @@
                                   <w:rPr>
                                     <w:sz w:val="22"/>
                                     <w:szCs w:val="22"/>
+                                    <w:lang w:val="en-US"/>
                                   </w:rPr>
                                 </w:pPr>
                                 <w:r>
@@ -839,13 +840,59 @@
                               </w:p>
                               <w:p>
                                 <w:pPr>
+                                  <w:pStyle w:val="Web"/>
+                                  <w:jc w:val="center"/>
+                                  <w:rPr>
+                                    <w:sz w:val="22"/>
+                                    <w:szCs w:val="22"/>
+                                    <w:lang w:val="en-US"/>
+                                  </w:rPr>
+                                </w:pPr>
+                                <w:hyperlink r:id="rId7" w:history="1">
+                                  <w:proofErr w:type="spellStart"/>
+                                  <w:r>
+                                    <w:rPr>
+                                      <w:rStyle w:val="-"/>
+                                      <w:b/>
+                                      <w:bCs/>
+                                      <w:sz w:val="22"/>
+                                      <w:szCs w:val="22"/>
+                                      <w:lang w:val="en-US"/>
+                                    </w:rPr>
+                                    <w:t>Github</w:t>
+                                  </w:r>
+                                  <w:proofErr w:type="spellEnd"/>
+                                  <w:r>
+                                    <w:rPr>
+                                      <w:rStyle w:val="-"/>
+                                      <w:b/>
+                                      <w:bCs/>
+                                      <w:sz w:val="22"/>
+                                      <w:szCs w:val="22"/>
+                                      <w:lang w:val="en-US"/>
+                                    </w:rPr>
+                                    <w:t xml:space="preserve"> Repository</w:t>
+                                  </w:r>
+                                </w:hyperlink>
+                                <w:bookmarkStart w:id="0" w:name="_GoBack"/>
+                                <w:bookmarkEnd w:id="0"/>
+                              </w:p>
+                              <w:p>
+                                <w:pPr>
                                   <w:suppressOverlap/>
                                   <w:rPr>
                                     <w:color w:val="1F497D" w:themeColor="text2"/>
+                                    <w:lang w:val="en-US"/>
                                   </w:rPr>
                                 </w:pPr>
                               </w:p>
-                              <w:p/>
+                              <w:p>
+                                <w:pPr>
+                                  <w:rPr>
+                                    <w:lang w:val="en-US"/>
+                                  </w:rPr>
+                                </w:pPr>
+                              </w:p>
                             </w:txbxContent>
                           </wps:txbx>
                           <wps:bodyPr rot="0" spcFirstLastPara="0" vertOverflow="overflow" horzOverflow="overflow" vert="horz" wrap="square" lIns="91440" tIns="182880" rIns="91440" bIns="91440" numCol="1" spcCol="0" rtlCol="0" fromWordArt="0" anchor="t" anchorCtr="0" forceAA="0" compatLnSpc="1">
@@ -1101,6 +1148,7 @@
                             <w:rPr>
                               <w:sz w:val="22"/>
                               <w:szCs w:val="22"/>
+                              <w:lang w:val="en-US"/>
                             </w:rPr>
                           </w:pPr>
                           <w:r>
@@ -1131,13 +1179,59 @@
                         </w:p>
                         <w:p>
                           <w:pPr>
+                            <w:pStyle w:val="Web"/>
+                            <w:jc w:val="center"/>
+                            <w:rPr>
+                              <w:sz w:val="22"/>
+                              <w:szCs w:val="22"/>
+                              <w:lang w:val="en-US"/>
+                            </w:rPr>
+                          </w:pPr>
+                          <w:hyperlink r:id="rId8" w:history="1">
+                            <w:proofErr w:type="spellStart"/>
+                            <w:r>
+                              <w:rPr>
+                                <w:rStyle w:val="-"/>
+                                <w:b/>
+                                <w:bCs/>
+                                <w:sz w:val="22"/>
+                                <w:szCs w:val="22"/>
+                                <w:lang w:val="en-US"/>
+                              </w:rPr>
+                              <w:t>Github</w:t>
+                            </w:r>
+                            <w:proofErr w:type="spellEnd"/>
+                            <w:r>
+                              <w:rPr>
+                                <w:rStyle w:val="-"/>
+                                <w:b/>
+                                <w:bCs/>
+                                <w:sz w:val="22"/>
+                                <w:szCs w:val="22"/>
+                                <w:lang w:val="en-US"/>
+                              </w:rPr>
+                              <w:t xml:space="preserve"> Repository</w:t>
+                            </w:r>
+                          </w:hyperlink>
+                          <w:bookmarkStart w:id="1" w:name="_GoBack"/>
+                          <w:bookmarkEnd w:id="1"/>
+                        </w:p>
+                        <w:p>
+                          <w:pPr>
                             <w:suppressOverlap/>
                             <w:rPr>
                               <w:color w:val="1F497D" w:themeColor="text2"/>
+                              <w:lang w:val="en-US"/>
                             </w:rPr>
                           </w:pPr>
                         </w:p>
-                        <w:p/>
+                        <w:p>
+                          <w:pPr>
+                            <w:rPr>
+                              <w:lang w:val="en-US"/>
+                            </w:rPr>
+                          </w:pPr>
+                        </w:p>
                       </w:txbxContent>
                     </v:textbox>
                     <w10:wrap anchorx="margin" anchory="margin"/>
@@ -1476,8 +1570,6 @@
         </w:rPr>
       </w:sdtEndPr>
       <w:sdtContent>
-        <w:bookmarkStart w:id="0" w:name="_GoBack" w:displacedByCustomXml="prev"/>
-        <w:bookmarkEnd w:id="0" w:displacedByCustomXml="prev"/>
         <w:p>
           <w:pPr>
             <w:pStyle w:val="a5"/>
@@ -3068,12 +3160,12 @@
           <w:numId w:val="3"/>
         </w:numPr>
       </w:pPr>
-      <w:bookmarkStart w:id="1" w:name="_Toc228197858"/>
+      <w:bookmarkStart w:id="2" w:name="_Toc228197858"/>
       <w:r>
         <w:lastRenderedPageBreak/>
         <w:t>Εισαγωγή</w:t>
       </w:r>
-      <w:bookmarkEnd w:id="1"/>
+      <w:bookmarkEnd w:id="2"/>
     </w:p>
     <w:p>
       <w:pPr>
@@ -3175,7 +3267,7 @@
         </w:rPr>
         <w:t xml:space="preserve">, </w:t>
       </w:r>
-      <w:hyperlink r:id="rId7" w:history="1">
+      <w:hyperlink r:id="rId9" w:history="1">
         <w:r>
           <w:rPr>
             <w:rStyle w:val="-"/>
@@ -3191,7 +3283,7 @@
         </w:rPr>
         <w:t xml:space="preserve"> , </w:t>
       </w:r>
-      <w:hyperlink r:id="rId8" w:history="1">
+      <w:hyperlink r:id="rId10" w:history="1">
         <w:proofErr w:type="spellStart"/>
         <w:r>
           <w:rPr>
@@ -3224,7 +3316,7 @@
         </w:rPr>
         <w:t xml:space="preserve"> και </w:t>
       </w:r>
-      <w:hyperlink r:id="rId9" w:history="1">
+      <w:hyperlink r:id="rId11" w:history="1">
         <w:r>
           <w:rPr>
             <w:rStyle w:val="-"/>
@@ -3292,11 +3384,11 @@
           <w:numId w:val="3"/>
         </w:numPr>
       </w:pPr>
-      <w:bookmarkStart w:id="2" w:name="_Toc228197859"/>
+      <w:bookmarkStart w:id="3" w:name="_Toc228197859"/>
       <w:r>
         <w:t>Μεθοδολογία και Εργαλεία Υλοποίησης</w:t>
       </w:r>
-      <w:bookmarkEnd w:id="2"/>
+      <w:bookmarkEnd w:id="3"/>
     </w:p>
     <w:p>
       <w:r>
@@ -3524,11 +3616,11 @@
           <w:lang w:val="en-US"/>
         </w:rPr>
       </w:pPr>
-      <w:bookmarkStart w:id="3" w:name="_Toc228197860"/>
+      <w:bookmarkStart w:id="4" w:name="_Toc228197860"/>
       <w:r>
         <w:t>Περιγραφή Κώδικα</w:t>
       </w:r>
-      <w:bookmarkEnd w:id="3"/>
+      <w:bookmarkEnd w:id="4"/>
     </w:p>
     <w:p>
       <w:r>
@@ -3572,7 +3664,7 @@
           <w:numId w:val="3"/>
         </w:numPr>
       </w:pPr>
-      <w:bookmarkStart w:id="4" w:name="_Toc228197861"/>
+      <w:bookmarkStart w:id="5" w:name="_Toc228197861"/>
       <w:r>
         <w:t xml:space="preserve">Κλάση </w:t>
       </w:r>
@@ -3583,7 +3675,7 @@
         </w:rPr>
         <w:t>scraperPage</w:t>
       </w:r>
-      <w:bookmarkEnd w:id="4"/>
+      <w:bookmarkEnd w:id="5"/>
       <w:proofErr w:type="spellEnd"/>
     </w:p>
     <w:p>
@@ -5372,7 +5464,7 @@
           <w:lang w:val="en-US"/>
         </w:rPr>
       </w:pPr>
-      <w:bookmarkStart w:id="5" w:name="_Toc228197862"/>
+      <w:bookmarkStart w:id="6" w:name="_Toc228197862"/>
       <w:r>
         <w:t xml:space="preserve">Κλάση </w:t>
       </w:r>
@@ -5382,7 +5474,7 @@
         </w:rPr>
         <w:t>Find</w:t>
       </w:r>
-      <w:bookmarkEnd w:id="5"/>
+      <w:bookmarkEnd w:id="6"/>
     </w:p>
     <w:p>
       <w:r>
@@ -14142,12 +14234,12 @@
           <w:numId w:val="3"/>
         </w:numPr>
       </w:pPr>
-      <w:bookmarkStart w:id="6" w:name="_Toc228197863"/>
+      <w:bookmarkStart w:id="7" w:name="_Toc228197863"/>
       <w:r>
         <w:lastRenderedPageBreak/>
         <w:t>Πειραματική Διαδικασία και Αξιολόγηση Αποτελεσμάτων</w:t>
       </w:r>
-      <w:bookmarkEnd w:id="6"/>
+      <w:bookmarkEnd w:id="7"/>
     </w:p>
     <w:p>
       <w:pPr>
@@ -14157,11 +14249,11 @@
           <w:numId w:val="3"/>
         </w:numPr>
       </w:pPr>
-      <w:bookmarkStart w:id="7" w:name="_Toc228197864"/>
+      <w:bookmarkStart w:id="8" w:name="_Toc228197864"/>
       <w:r>
         <w:t>Φάση Ανάπτυξης</w:t>
       </w:r>
-      <w:bookmarkEnd w:id="7"/>
+      <w:bookmarkEnd w:id="8"/>
     </w:p>
     <w:p>
       <w:r>
@@ -14259,299 +14351,6 @@
             <wp:extent cx="4655820" cy="1181100"/>
             <wp:effectExtent l="0" t="0" r="0" b="0"/>
             <wp:docPr id="10" name="Εικόνα 10"/>
-            <wp:cNvGraphicFramePr>
-              <a:graphicFrameLocks xmlns:a="http://schemas.openxmlformats.org/drawingml/2006/main" noChangeAspect="1"/>
-            </wp:cNvGraphicFramePr>
-            <a:graphic xmlns:a="http://schemas.openxmlformats.org/drawingml/2006/main">
-              <a:graphicData uri="http://schemas.openxmlformats.org/drawingml/2006/picture">
-                <pic:pic xmlns:pic="http://schemas.openxmlformats.org/drawingml/2006/picture">
-                  <pic:nvPicPr>
-                    <pic:cNvPr id="0" name=""/>
-                    <pic:cNvPicPr/>
-                  </pic:nvPicPr>
-                  <pic:blipFill>
-                    <a:blip r:embed="rId10"/>
-                    <a:stretch>
-                      <a:fillRect/>
-                    </a:stretch>
-                  </pic:blipFill>
-                  <pic:spPr>
-                    <a:xfrm>
-                      <a:off x="0" y="0"/>
-                      <a:ext cx="4655820" cy="1181100"/>
-                    </a:xfrm>
-                    <a:prstGeom prst="rect">
-                      <a:avLst/>
-                    </a:prstGeom>
-                  </pic:spPr>
-                </pic:pic>
-              </a:graphicData>
-            </a:graphic>
-          </wp:inline>
-        </w:drawing>
-      </w:r>
-    </w:p>
-    <w:p>
-      <w:pPr>
-        <w:pStyle w:val="a7"/>
-        <w:jc w:val="left"/>
-      </w:pPr>
-      <w:bookmarkStart w:id="8" w:name="_Toc228198625"/>
-      <w:r>
-        <w:t xml:space="preserve">Στιγμιότυπο Εκτέλεσης </w:t>
-      </w:r>
-      <w:r>
-        <w:fldChar w:fldCharType="begin"/>
-      </w:r>
-      <w:r>
-        <w:instrText xml:space="preserve"> SEQ Στιγμιότυπο_Εκτέλεσης \* ARABIC </w:instrText>
-      </w:r>
-      <w:r>
-        <w:fldChar w:fldCharType="separate"/>
-      </w:r>
-      <w:r>
-        <w:rPr>
-          <w:noProof/>
-        </w:rPr>
-        <w:t>1</w:t>
-      </w:r>
-      <w:r>
-        <w:fldChar w:fldCharType="end"/>
-      </w:r>
-      <w:r>
-        <w:t xml:space="preserve"> </w:t>
-      </w:r>
-      <w:bookmarkStart w:id="9" w:name="_Toc228198502"/>
-      <w:r>
-        <w:t>Αθήνα</w:t>
-      </w:r>
-      <w:bookmarkEnd w:id="8"/>
-      <w:bookmarkEnd w:id="9"/>
-    </w:p>
-    <w:p>
-      <w:pPr>
-        <w:pStyle w:val="a6"/>
-        <w:numPr>
-          <w:ilvl w:val="0"/>
-          <w:numId w:val="8"/>
-        </w:numPr>
-        <w:rPr>
-          <w:b/>
-          <w:sz w:val="28"/>
-        </w:rPr>
-      </w:pPr>
-      <w:r>
-        <w:rPr>
-          <w:b/>
-          <w:sz w:val="28"/>
-        </w:rPr>
-        <w:t>Θεσσαλονίκη</w:t>
-      </w:r>
-    </w:p>
-    <w:p>
-      <w:pPr>
-        <w:pStyle w:val="a6"/>
-        <w:ind w:firstLine="0"/>
-      </w:pPr>
-      <w:r>
-        <w:t>Ε</w:t>
-      </w:r>
-      <w:r>
-        <w:t xml:space="preserve">πιλέχθηκε λόγω της </w:t>
-      </w:r>
-      <w:proofErr w:type="spellStart"/>
-      <w:r>
-        <w:t>πολυεπίπεδης</w:t>
-      </w:r>
-      <w:proofErr w:type="spellEnd"/>
-      <w:r>
-        <w:t xml:space="preserve"> πληροφορίας που περιέχει το </w:t>
-      </w:r>
-      <w:proofErr w:type="spellStart"/>
-      <w:r>
-        <w:t>Infobox</w:t>
-      </w:r>
-      <w:proofErr w:type="spellEnd"/>
-      <w:r>
-        <w:t xml:space="preserve"> </w:t>
-      </w:r>
-      <w:r>
-        <w:t xml:space="preserve">της καθώς και λόγο της πληροφορίας </w:t>
-      </w:r>
-      <w:r>
-        <w:rPr>
-          <w:lang w:val="en-US"/>
-        </w:rPr>
-        <w:t>Region</w:t>
-      </w:r>
-      <w:r>
-        <w:t xml:space="preserve"> </w:t>
-      </w:r>
-      <w:r>
-        <w:t xml:space="preserve">η οποία αποτελείται από παραπάνω από μια </w:t>
-      </w:r>
-      <w:proofErr w:type="spellStart"/>
-      <w:r>
-        <w:t>λεξείς</w:t>
-      </w:r>
-      <w:proofErr w:type="spellEnd"/>
-      <w:r>
-        <w:t>. Ο κώδικας σχεδιάστηκε έτσι ώστε να απομονώνει με ακρίβεια τον πληθυσμό, αγνοώντας ενδιάμεσες παραπομπές (όπως βιβλιογραφικούς δείκτες σε αγκύλες) ή δευτερεύοντα στατιστικά στοιχεία (όπως η πληθυσμιακή πυκνότητα). Με αυτόν τον τρόπο, επιτεύχθηκε ο σαφής διαχωρισμός των δεδομένων, ακόμα και όταν αυτά εμφανίζονται σε πολύ κοντινή απόσταση στο κείμενο.</w:t>
-      </w:r>
-    </w:p>
-    <w:p>
-      <w:pPr>
-        <w:pStyle w:val="a6"/>
-        <w:keepNext/>
-        <w:ind w:firstLine="0"/>
-      </w:pPr>
-      <w:r>
-        <w:rPr>
-          <w:noProof/>
-          <w:lang w:eastAsia="el-GR"/>
-        </w:rPr>
-        <w:lastRenderedPageBreak/>
-        <w:drawing>
-          <wp:inline distT="0" distB="0" distL="0" distR="0" wp14:anchorId="0C70D5C4" wp14:editId="5FC58150">
-            <wp:extent cx="4693920" cy="1181100"/>
-            <wp:effectExtent l="0" t="0" r="0" b="0"/>
-            <wp:docPr id="1" name="Εικόνα 1"/>
-            <wp:cNvGraphicFramePr>
-              <a:graphicFrameLocks xmlns:a="http://schemas.openxmlformats.org/drawingml/2006/main" noChangeAspect="1"/>
-            </wp:cNvGraphicFramePr>
-            <a:graphic xmlns:a="http://schemas.openxmlformats.org/drawingml/2006/main">
-              <a:graphicData uri="http://schemas.openxmlformats.org/drawingml/2006/picture">
-                <pic:pic xmlns:pic="http://schemas.openxmlformats.org/drawingml/2006/picture">
-                  <pic:nvPicPr>
-                    <pic:cNvPr id="0" name=""/>
-                    <pic:cNvPicPr/>
-                  </pic:nvPicPr>
-                  <pic:blipFill>
-                    <a:blip r:embed="rId11"/>
-                    <a:stretch>
-                      <a:fillRect/>
-                    </a:stretch>
-                  </pic:blipFill>
-                  <pic:spPr>
-                    <a:xfrm>
-                      <a:off x="0" y="0"/>
-                      <a:ext cx="4693920" cy="1181100"/>
-                    </a:xfrm>
-                    <a:prstGeom prst="rect">
-                      <a:avLst/>
-                    </a:prstGeom>
-                  </pic:spPr>
-                </pic:pic>
-              </a:graphicData>
-            </a:graphic>
-          </wp:inline>
-        </w:drawing>
-      </w:r>
-    </w:p>
-    <w:p>
-      <w:pPr>
-        <w:pStyle w:val="a7"/>
-        <w:rPr>
-          <w:lang w:val="en-US"/>
-        </w:rPr>
-      </w:pPr>
-      <w:bookmarkStart w:id="10" w:name="_Toc228198626"/>
-      <w:r>
-        <w:t xml:space="preserve">Στιγμιότυπο Εκτέλεσης </w:t>
-      </w:r>
-      <w:r>
-        <w:fldChar w:fldCharType="begin"/>
-      </w:r>
-      <w:r>
-        <w:instrText xml:space="preserve"> SEQ Στιγμιότυπο_Εκτέλεσης \* ARABIC </w:instrText>
-      </w:r>
-      <w:r>
-        <w:fldChar w:fldCharType="separate"/>
-      </w:r>
-      <w:r>
-        <w:rPr>
-          <w:noProof/>
-        </w:rPr>
-        <w:t>2</w:t>
-      </w:r>
-      <w:r>
-        <w:fldChar w:fldCharType="end"/>
-      </w:r>
-      <w:r>
-        <w:t xml:space="preserve"> </w:t>
-      </w:r>
-      <w:bookmarkStart w:id="11" w:name="_Toc228198503"/>
-      <w:r>
-        <w:t>Θεσσαλονίκη</w:t>
-      </w:r>
-      <w:bookmarkEnd w:id="10"/>
-      <w:bookmarkEnd w:id="11"/>
-    </w:p>
-    <w:p>
-      <w:pPr>
-        <w:pStyle w:val="a6"/>
-        <w:ind w:firstLine="0"/>
-        <w:rPr>
-          <w:lang w:val="en-US"/>
-        </w:rPr>
-      </w:pPr>
-    </w:p>
-    <w:p>
-      <w:pPr>
-        <w:pStyle w:val="a6"/>
-        <w:numPr>
-          <w:ilvl w:val="0"/>
-          <w:numId w:val="8"/>
-        </w:numPr>
-        <w:rPr>
-          <w:b/>
-          <w:sz w:val="28"/>
-        </w:rPr>
-      </w:pPr>
-      <w:r>
-        <w:rPr>
-          <w:b/>
-          <w:sz w:val="28"/>
-        </w:rPr>
-        <w:t xml:space="preserve">Νέα Ιωνία </w:t>
-      </w:r>
-    </w:p>
-    <w:p>
-      <w:pPr>
-        <w:pStyle w:val="a6"/>
-        <w:ind w:firstLine="0"/>
-      </w:pPr>
-      <w:r>
-        <w:t>Η Νέα Ιωνία επιλέχθηκε ώστε να γίνει</w:t>
-      </w:r>
-      <w:r>
-        <w:t xml:space="preserve"> γενίκευση του κώδικα για ονόματα πόλεων που αποτελούνται από περισσότερες από μία λέξεις. Παράλληλα, αναπτύχθηκε η λογική αναγνώρισης πολλαπλών ετικετών (όπως η επανάληψη του όρου "</w:t>
-      </w:r>
-      <w:proofErr w:type="spellStart"/>
-      <w:r>
-        <w:t>Municipality</w:t>
-      </w:r>
-      <w:proofErr w:type="spellEnd"/>
-      <w:r>
-        <w:t>" για την έκταση και τον πληθυσμό), επιτρέποντας στο πρόγραμμα να πλοηγείται με ακρίβεια στα σωστά πεδία πληροφοριών βάσει των συμφραζομένων της σελίδας.</w:t>
-      </w:r>
-    </w:p>
-    <w:p>
-      <w:pPr>
-        <w:pStyle w:val="a6"/>
-        <w:keepNext/>
-        <w:ind w:firstLine="0"/>
-      </w:pPr>
-      <w:r>
-        <w:rPr>
-          <w:noProof/>
-          <w:lang w:eastAsia="el-GR"/>
-        </w:rPr>
-        <w:drawing>
-          <wp:inline distT="0" distB="0" distL="0" distR="0" wp14:anchorId="36FED459" wp14:editId="69251E97">
-            <wp:extent cx="3147060" cy="1173480"/>
-            <wp:effectExtent l="0" t="0" r="0" b="7620"/>
-            <wp:docPr id="9" name="Εικόνα 9"/>
             <wp:cNvGraphicFramePr>
               <a:graphicFrameLocks xmlns:a="http://schemas.openxmlformats.org/drawingml/2006/main" noChangeAspect="1"/>
             </wp:cNvGraphicFramePr>
@@ -14571,7 +14370,7 @@
                   <pic:spPr>
                     <a:xfrm>
                       <a:off x="0" y="0"/>
-                      <a:ext cx="3147060" cy="1173480"/>
+                      <a:ext cx="4655820" cy="1181100"/>
                     </a:xfrm>
                     <a:prstGeom prst="rect">
                       <a:avLst/>
@@ -14587,8 +14386,9 @@
     <w:p>
       <w:pPr>
         <w:pStyle w:val="a7"/>
-      </w:pPr>
-      <w:bookmarkStart w:id="12" w:name="_Toc228198627"/>
+        <w:jc w:val="left"/>
+      </w:pPr>
+      <w:bookmarkStart w:id="9" w:name="_Toc228198625"/>
       <w:r>
         <w:t xml:space="preserve">Στιγμιότυπο Εκτέλεσης </w:t>
       </w:r>
@@ -14605,7 +14405,7 @@
         <w:rPr>
           <w:noProof/>
         </w:rPr>
-        <w:t>3</w:t>
+        <w:t>1</w:t>
       </w:r>
       <w:r>
         <w:fldChar w:fldCharType="end"/>
@@ -14613,56 +14413,82 @@
       <w:r>
         <w:t xml:space="preserve"> </w:t>
       </w:r>
-      <w:bookmarkStart w:id="13" w:name="_Toc228198504"/>
-      <w:r>
-        <w:t>Νέα Ιωνία</w:t>
-      </w:r>
-      <w:bookmarkEnd w:id="12"/>
-      <w:bookmarkEnd w:id="13"/>
-    </w:p>
-    <w:p>
-      <w:pPr>
-        <w:pStyle w:val="2"/>
-        <w:numPr>
-          <w:ilvl w:val="1"/>
-          <w:numId w:val="3"/>
-        </w:numPr>
-      </w:pPr>
-      <w:bookmarkStart w:id="14" w:name="_Toc228197865"/>
-      <w:r>
-        <w:t>Φάση Ελέγχου</w:t>
-      </w:r>
-      <w:bookmarkEnd w:id="14"/>
-    </w:p>
-    <w:p>
-      <w:r>
-        <w:t>Σε αυτή τη φάση ελέγξαμε τον κώδικα που αναπτύξαμε προηγουμένως σε ένα ευρύτερο δείγμα πόλεων οι οποίες δεν είχαν ληφθεί υπόψη κατά τον αρχικό σχεδιασμό των κανονικών εκφράσεων, με στόχο την αξιολόγηση της ακρίβειας και της γενίκευσης του προγράμματος.</w:t>
-      </w:r>
+      <w:bookmarkStart w:id="10" w:name="_Toc228198502"/>
+      <w:r>
+        <w:t>Αθήνα</w:t>
+      </w:r>
+      <w:bookmarkEnd w:id="9"/>
+      <w:bookmarkEnd w:id="10"/>
     </w:p>
     <w:p>
       <w:pPr>
         <w:pStyle w:val="a6"/>
         <w:numPr>
           <w:ilvl w:val="0"/>
-          <w:numId w:val="10"/>
+          <w:numId w:val="8"/>
         </w:numPr>
-      </w:pPr>
-      <w:r>
         <w:rPr>
           <w:b/>
           <w:sz w:val="28"/>
         </w:rPr>
-        <w:t>Λάρισα</w:t>
-      </w:r>
+      </w:pPr>
       <w:r>
         <w:rPr>
           <w:b/>
           <w:sz w:val="28"/>
         </w:rPr>
-        <w:t xml:space="preserve"> (με πίνακα θερμοκρασίας</w:t>
-      </w:r>
-      <w:r>
-        <w:t>)</w:t>
+        <w:t>Θεσσαλονίκη</w:t>
+      </w:r>
+    </w:p>
+    <w:p>
+      <w:pPr>
+        <w:pStyle w:val="a6"/>
+        <w:ind w:firstLine="0"/>
+      </w:pPr>
+      <w:r>
+        <w:t>Ε</w:t>
+      </w:r>
+      <w:r>
+        <w:t xml:space="preserve">πιλέχθηκε λόγω της </w:t>
+      </w:r>
+      <w:proofErr w:type="spellStart"/>
+      <w:r>
+        <w:t>πολυεπίπεδης</w:t>
+      </w:r>
+      <w:proofErr w:type="spellEnd"/>
+      <w:r>
+        <w:t xml:space="preserve"> πληροφορίας που περιέχει το </w:t>
+      </w:r>
+      <w:proofErr w:type="spellStart"/>
+      <w:r>
+        <w:t>Infobox</w:t>
+      </w:r>
+      <w:proofErr w:type="spellEnd"/>
+      <w:r>
+        <w:t xml:space="preserve"> </w:t>
+      </w:r>
+      <w:r>
+        <w:t xml:space="preserve">της καθώς και λόγο της πληροφορίας </w:t>
+      </w:r>
+      <w:r>
+        <w:rPr>
+          <w:lang w:val="en-US"/>
+        </w:rPr>
+        <w:t>Region</w:t>
+      </w:r>
+      <w:r>
+        <w:t xml:space="preserve"> </w:t>
+      </w:r>
+      <w:r>
+        <w:t xml:space="preserve">η οποία αποτελείται από παραπάνω από μια </w:t>
+      </w:r>
+      <w:proofErr w:type="spellStart"/>
+      <w:r>
+        <w:t>λεξείς</w:t>
+      </w:r>
+      <w:proofErr w:type="spellEnd"/>
+      <w:r>
+        <w:t>. Ο κώδικας σχεδιάστηκε έτσι ώστε να απομονώνει με ακρίβεια τον πληθυσμό, αγνοώντας ενδιάμεσες παραπομπές (όπως βιβλιογραφικούς δείκτες σε αγκύλες) ή δευτερεύοντα στατιστικά στοιχεία (όπως η πληθυσμιακή πυκνότητα). Με αυτόν τον τρόπο, επιτεύχθηκε ο σαφής διαχωρισμός των δεδομένων, ακόμα και όταν αυτά εμφανίζονται σε πολύ κοντινή απόσταση στο κείμενο.</w:t>
       </w:r>
     </w:p>
     <w:p>
@@ -14676,11 +14502,12 @@
           <w:noProof/>
           <w:lang w:eastAsia="el-GR"/>
         </w:rPr>
+        <w:lastRenderedPageBreak/>
         <w:drawing>
-          <wp:inline distT="0" distB="0" distL="0" distR="0" wp14:anchorId="501372E7" wp14:editId="152BDEEA">
-            <wp:extent cx="4747260" cy="1158240"/>
-            <wp:effectExtent l="0" t="0" r="0" b="3810"/>
-            <wp:docPr id="11" name="Εικόνα 11"/>
+          <wp:inline distT="0" distB="0" distL="0" distR="0" wp14:anchorId="0C70D5C4" wp14:editId="5FC58150">
+            <wp:extent cx="4693920" cy="1181100"/>
+            <wp:effectExtent l="0" t="0" r="0" b="0"/>
+            <wp:docPr id="1" name="Εικόνα 1"/>
             <wp:cNvGraphicFramePr>
               <a:graphicFrameLocks xmlns:a="http://schemas.openxmlformats.org/drawingml/2006/main" noChangeAspect="1"/>
             </wp:cNvGraphicFramePr>
@@ -14700,7 +14527,7 @@
                   <pic:spPr>
                     <a:xfrm>
                       <a:off x="0" y="0"/>
-                      <a:ext cx="4747260" cy="1158240"/>
+                      <a:ext cx="4693920" cy="1181100"/>
                     </a:xfrm>
                     <a:prstGeom prst="rect">
                       <a:avLst/>
@@ -14720,7 +14547,7 @@
           <w:lang w:val="en-US"/>
         </w:rPr>
       </w:pPr>
-      <w:bookmarkStart w:id="15" w:name="_Toc228198628"/>
+      <w:bookmarkStart w:id="11" w:name="_Toc228198626"/>
       <w:r>
         <w:t xml:space="preserve">Στιγμιότυπο Εκτέλεσης </w:t>
       </w:r>
@@ -14737,7 +14564,7 @@
         <w:rPr>
           <w:noProof/>
         </w:rPr>
-        <w:t>4</w:t>
+        <w:t>2</w:t>
       </w:r>
       <w:r>
         <w:fldChar w:fldCharType="end"/>
@@ -14745,19 +14572,28 @@
       <w:r>
         <w:t xml:space="preserve"> </w:t>
       </w:r>
-      <w:bookmarkStart w:id="16" w:name="_Toc228198505"/>
-      <w:r>
-        <w:t>Λάρισα</w:t>
-      </w:r>
-      <w:bookmarkEnd w:id="15"/>
-      <w:bookmarkEnd w:id="16"/>
+      <w:bookmarkStart w:id="12" w:name="_Toc228198503"/>
+      <w:r>
+        <w:t>Θεσσαλονίκη</w:t>
+      </w:r>
+      <w:bookmarkEnd w:id="11"/>
+      <w:bookmarkEnd w:id="12"/>
+    </w:p>
+    <w:p>
+      <w:pPr>
+        <w:pStyle w:val="a6"/>
+        <w:ind w:firstLine="0"/>
+        <w:rPr>
+          <w:lang w:val="en-US"/>
+        </w:rPr>
+      </w:pPr>
     </w:p>
     <w:p>
       <w:pPr>
         <w:pStyle w:val="a6"/>
         <w:numPr>
           <w:ilvl w:val="0"/>
-          <w:numId w:val="10"/>
+          <w:numId w:val="8"/>
         </w:numPr>
         <w:rPr>
           <w:b/>
@@ -14769,14 +14605,27 @@
           <w:b/>
           <w:sz w:val="28"/>
         </w:rPr>
-        <w:t>Τρίκαλα</w:t>
-      </w:r>
-      <w:r>
-        <w:rPr>
-          <w:b/>
-          <w:sz w:val="28"/>
-        </w:rPr>
-        <w:t xml:space="preserve"> (χωρίς πίνακα θερμοκρασίας)</w:t>
+        <w:t xml:space="preserve">Νέα Ιωνία </w:t>
+      </w:r>
+    </w:p>
+    <w:p>
+      <w:pPr>
+        <w:pStyle w:val="a6"/>
+        <w:ind w:firstLine="0"/>
+      </w:pPr>
+      <w:r>
+        <w:t>Η Νέα Ιωνία επιλέχθηκε ώστε να γίνει</w:t>
+      </w:r>
+      <w:r>
+        <w:t xml:space="preserve"> γενίκευση του κώδικα για ονόματα πόλεων που αποτελούνται από περισσότερες από μία λέξεις. Παράλληλα, αναπτύχθηκε η λογική αναγνώρισης πολλαπλών ετικετών (όπως η επανάληψη του όρου "</w:t>
+      </w:r>
+      <w:proofErr w:type="spellStart"/>
+      <w:r>
+        <w:t>Municipality</w:t>
+      </w:r>
+      <w:proofErr w:type="spellEnd"/>
+      <w:r>
+        <w:t>" για την έκταση και τον πληθυσμό), επιτρέποντας στο πρόγραμμα να πλοηγείται με ακρίβεια στα σωστά πεδία πληροφοριών βάσει των συμφραζομένων της σελίδας.</w:t>
       </w:r>
     </w:p>
     <w:p>
@@ -14790,12 +14639,11 @@
           <w:noProof/>
           <w:lang w:eastAsia="el-GR"/>
         </w:rPr>
-        <w:lastRenderedPageBreak/>
         <w:drawing>
-          <wp:inline distT="0" distB="0" distL="0" distR="0" wp14:anchorId="4F136610" wp14:editId="363F505A">
-            <wp:extent cx="3063240" cy="1173480"/>
-            <wp:effectExtent l="0" t="0" r="3810" b="7620"/>
-            <wp:docPr id="12" name="Εικόνα 12"/>
+          <wp:inline distT="0" distB="0" distL="0" distR="0" wp14:anchorId="36FED459" wp14:editId="69251E97">
+            <wp:extent cx="3147060" cy="1173480"/>
+            <wp:effectExtent l="0" t="0" r="0" b="7620"/>
+            <wp:docPr id="9" name="Εικόνα 9"/>
             <wp:cNvGraphicFramePr>
               <a:graphicFrameLocks xmlns:a="http://schemas.openxmlformats.org/drawingml/2006/main" noChangeAspect="1"/>
             </wp:cNvGraphicFramePr>
@@ -14815,7 +14663,7 @@
                   <pic:spPr>
                     <a:xfrm>
                       <a:off x="0" y="0"/>
-                      <a:ext cx="3063240" cy="1173480"/>
+                      <a:ext cx="3147060" cy="1173480"/>
                     </a:xfrm>
                     <a:prstGeom prst="rect">
                       <a:avLst/>
@@ -14831,11 +14679,8 @@
     <w:p>
       <w:pPr>
         <w:pStyle w:val="a7"/>
-        <w:rPr>
-          <w:lang w:val="en-US"/>
-        </w:rPr>
-      </w:pPr>
-      <w:bookmarkStart w:id="17" w:name="_Toc228198629"/>
+      </w:pPr>
+      <w:bookmarkStart w:id="13" w:name="_Toc228198627"/>
       <w:r>
         <w:t xml:space="preserve">Στιγμιότυπο Εκτέλεσης </w:t>
       </w:r>
@@ -14852,7 +14697,7 @@
         <w:rPr>
           <w:noProof/>
         </w:rPr>
-        <w:t>5</w:t>
+        <w:t>3</w:t>
       </w:r>
       <w:r>
         <w:fldChar w:fldCharType="end"/>
@@ -14860,12 +14705,31 @@
       <w:r>
         <w:t xml:space="preserve"> </w:t>
       </w:r>
-      <w:bookmarkStart w:id="18" w:name="_Toc228198506"/>
-      <w:r>
-        <w:t>Τρίκαλα</w:t>
-      </w:r>
-      <w:bookmarkEnd w:id="17"/>
-      <w:bookmarkEnd w:id="18"/>
+      <w:bookmarkStart w:id="14" w:name="_Toc228198504"/>
+      <w:r>
+        <w:t>Νέα Ιωνία</w:t>
+      </w:r>
+      <w:bookmarkEnd w:id="13"/>
+      <w:bookmarkEnd w:id="14"/>
+    </w:p>
+    <w:p>
+      <w:pPr>
+        <w:pStyle w:val="2"/>
+        <w:numPr>
+          <w:ilvl w:val="1"/>
+          <w:numId w:val="3"/>
+        </w:numPr>
+      </w:pPr>
+      <w:bookmarkStart w:id="15" w:name="_Toc228197865"/>
+      <w:r>
+        <w:t>Φάση Ελέγχου</w:t>
+      </w:r>
+      <w:bookmarkEnd w:id="15"/>
+    </w:p>
+    <w:p>
+      <w:r>
+        <w:t>Σε αυτή τη φάση ελέγξαμε τον κώδικα που αναπτύξαμε προηγουμένως σε ένα ευρύτερο δείγμα πόλεων οι οποίες δεν είχαν ληφθεί υπόψη κατά τον αρχικό σχεδιασμό των κανονικών εκφράσεων, με στόχο την αξιολόγηση της ακρίβειας και της γενίκευσης του προγράμματος.</w:t>
+      </w:r>
     </w:p>
     <w:p>
       <w:pPr>
@@ -14874,29 +14738,30 @@
           <w:ilvl w:val="0"/>
           <w:numId w:val="10"/>
         </w:numPr>
+      </w:pPr>
+      <w:r>
         <w:rPr>
           <w:b/>
           <w:sz w:val="28"/>
         </w:rPr>
-      </w:pPr>
+        <w:t>Λάρισα</w:t>
+      </w:r>
       <w:r>
         <w:rPr>
           <w:b/>
           <w:sz w:val="28"/>
         </w:rPr>
-        <w:t>Καρδίτσα</w:t>
-      </w:r>
-      <w:r>
-        <w:rPr>
-          <w:b/>
-          <w:sz w:val="28"/>
-        </w:rPr>
-        <w:t xml:space="preserve"> (χωρίς πίνακα θερμοκρασίας)</w:t>
+        <w:t xml:space="preserve"> (με πίνακα θερμοκρασίας</w:t>
+      </w:r>
+      <w:r>
+        <w:t>)</w:t>
       </w:r>
     </w:p>
     <w:p>
       <w:pPr>
+        <w:pStyle w:val="a6"/>
         <w:keepNext/>
+        <w:ind w:firstLine="0"/>
       </w:pPr>
       <w:r>
         <w:rPr>
@@ -14904,10 +14769,10 @@
           <w:lang w:eastAsia="el-GR"/>
         </w:rPr>
         <w:drawing>
-          <wp:inline distT="0" distB="0" distL="0" distR="0" wp14:anchorId="35FA4CAF" wp14:editId="5E5CB40F">
-            <wp:extent cx="3048000" cy="1188720"/>
-            <wp:effectExtent l="0" t="0" r="0" b="0"/>
-            <wp:docPr id="13" name="Εικόνα 13"/>
+          <wp:inline distT="0" distB="0" distL="0" distR="0" wp14:anchorId="501372E7" wp14:editId="152BDEEA">
+            <wp:extent cx="4747260" cy="1158240"/>
+            <wp:effectExtent l="0" t="0" r="0" b="3810"/>
+            <wp:docPr id="11" name="Εικόνα 11"/>
             <wp:cNvGraphicFramePr>
               <a:graphicFrameLocks xmlns:a="http://schemas.openxmlformats.org/drawingml/2006/main" noChangeAspect="1"/>
             </wp:cNvGraphicFramePr>
@@ -14927,7 +14792,7 @@
                   <pic:spPr>
                     <a:xfrm>
                       <a:off x="0" y="0"/>
-                      <a:ext cx="3048000" cy="1188720"/>
+                      <a:ext cx="4747260" cy="1158240"/>
                     </a:xfrm>
                     <a:prstGeom prst="rect">
                       <a:avLst/>
@@ -14943,8 +14808,11 @@
     <w:p>
       <w:pPr>
         <w:pStyle w:val="a7"/>
-      </w:pPr>
-      <w:bookmarkStart w:id="19" w:name="_Toc228198630"/>
+        <w:rPr>
+          <w:lang w:val="en-US"/>
+        </w:rPr>
+      </w:pPr>
+      <w:bookmarkStart w:id="16" w:name="_Toc228198628"/>
       <w:r>
         <w:t xml:space="preserve">Στιγμιότυπο Εκτέλεσης </w:t>
       </w:r>
@@ -14961,7 +14829,7 @@
         <w:rPr>
           <w:noProof/>
         </w:rPr>
-        <w:t>6</w:t>
+        <w:t>4</w:t>
       </w:r>
       <w:r>
         <w:fldChar w:fldCharType="end"/>
@@ -14969,19 +14837,12 @@
       <w:r>
         <w:t xml:space="preserve"> </w:t>
       </w:r>
-      <w:bookmarkStart w:id="20" w:name="_Toc228198507"/>
-      <w:r>
-        <w:t>Καρδίτσα</w:t>
-      </w:r>
-      <w:bookmarkEnd w:id="19"/>
-      <w:bookmarkEnd w:id="20"/>
-    </w:p>
-    <w:p>
-      <w:pPr>
-        <w:rPr>
-          <w:lang w:val="en-US"/>
-        </w:rPr>
-      </w:pPr>
+      <w:bookmarkStart w:id="17" w:name="_Toc228198505"/>
+      <w:r>
+        <w:t>Λάρισα</w:t>
+      </w:r>
+      <w:bookmarkEnd w:id="16"/>
+      <w:bookmarkEnd w:id="17"/>
     </w:p>
     <w:p>
       <w:pPr>
@@ -15000,14 +14861,14 @@
           <w:b/>
           <w:sz w:val="28"/>
         </w:rPr>
-        <w:t>Πάτρα</w:t>
+        <w:t>Τρίκαλα</w:t>
       </w:r>
       <w:r>
         <w:rPr>
           <w:b/>
           <w:sz w:val="28"/>
         </w:rPr>
-        <w:t xml:space="preserve"> (με πίνακα θερμοκρασίας)</w:t>
+        <w:t xml:space="preserve"> (χωρίς πίνακα θερμοκρασίας)</w:t>
       </w:r>
     </w:p>
     <w:p>
@@ -15021,11 +14882,12 @@
           <w:noProof/>
           <w:lang w:eastAsia="el-GR"/>
         </w:rPr>
+        <w:lastRenderedPageBreak/>
         <w:drawing>
-          <wp:inline distT="0" distB="0" distL="0" distR="0" wp14:anchorId="25747F2A" wp14:editId="013F2E53">
-            <wp:extent cx="4732020" cy="1188720"/>
-            <wp:effectExtent l="0" t="0" r="0" b="0"/>
-            <wp:docPr id="14" name="Εικόνα 14"/>
+          <wp:inline distT="0" distB="0" distL="0" distR="0" wp14:anchorId="4F136610" wp14:editId="363F505A">
+            <wp:extent cx="3063240" cy="1173480"/>
+            <wp:effectExtent l="0" t="0" r="3810" b="7620"/>
+            <wp:docPr id="12" name="Εικόνα 12"/>
             <wp:cNvGraphicFramePr>
               <a:graphicFrameLocks xmlns:a="http://schemas.openxmlformats.org/drawingml/2006/main" noChangeAspect="1"/>
             </wp:cNvGraphicFramePr>
@@ -15045,7 +14907,7 @@
                   <pic:spPr>
                     <a:xfrm>
                       <a:off x="0" y="0"/>
-                      <a:ext cx="4732020" cy="1188720"/>
+                      <a:ext cx="3063240" cy="1173480"/>
                     </a:xfrm>
                     <a:prstGeom prst="rect">
                       <a:avLst/>
@@ -15061,8 +14923,11 @@
     <w:p>
       <w:pPr>
         <w:pStyle w:val="a7"/>
-      </w:pPr>
-      <w:bookmarkStart w:id="21" w:name="_Toc228198631"/>
+        <w:rPr>
+          <w:lang w:val="en-US"/>
+        </w:rPr>
+      </w:pPr>
+      <w:bookmarkStart w:id="18" w:name="_Toc228198629"/>
       <w:r>
         <w:t xml:space="preserve">Στιγμιότυπο Εκτέλεσης </w:t>
       </w:r>
@@ -15079,7 +14944,7 @@
         <w:rPr>
           <w:noProof/>
         </w:rPr>
-        <w:t>7</w:t>
+        <w:t>5</w:t>
       </w:r>
       <w:r>
         <w:fldChar w:fldCharType="end"/>
@@ -15087,12 +14952,12 @@
       <w:r>
         <w:t xml:space="preserve"> </w:t>
       </w:r>
-      <w:bookmarkStart w:id="22" w:name="_Toc228198508"/>
-      <w:r>
-        <w:t>Πάτρα</w:t>
-      </w:r>
-      <w:bookmarkEnd w:id="21"/>
-      <w:bookmarkEnd w:id="22"/>
+      <w:bookmarkStart w:id="19" w:name="_Toc228198506"/>
+      <w:r>
+        <w:t>Τρίκαλα</w:t>
+      </w:r>
+      <w:bookmarkEnd w:id="18"/>
+      <w:bookmarkEnd w:id="19"/>
     </w:p>
     <w:p>
       <w:pPr>
@@ -15111,7 +14976,7 @@
           <w:b/>
           <w:sz w:val="28"/>
         </w:rPr>
-        <w:t>Ιωάννινα</w:t>
+        <w:t>Καρδίτσα</w:t>
       </w:r>
       <w:r>
         <w:rPr>
@@ -15123,9 +14988,7 @@
     </w:p>
     <w:p>
       <w:pPr>
-        <w:pStyle w:val="a6"/>
         <w:keepNext/>
-        <w:ind w:firstLine="0"/>
       </w:pPr>
       <w:r>
         <w:rPr>
@@ -15133,10 +14996,10 @@
           <w:lang w:eastAsia="el-GR"/>
         </w:rPr>
         <w:drawing>
-          <wp:inline distT="0" distB="0" distL="0" distR="0" wp14:anchorId="6FE0E53D" wp14:editId="21C7531E">
-            <wp:extent cx="3657600" cy="1173480"/>
-            <wp:effectExtent l="0" t="0" r="0" b="7620"/>
-            <wp:docPr id="15" name="Εικόνα 15"/>
+          <wp:inline distT="0" distB="0" distL="0" distR="0" wp14:anchorId="35FA4CAF" wp14:editId="5E5CB40F">
+            <wp:extent cx="3048000" cy="1188720"/>
+            <wp:effectExtent l="0" t="0" r="0" b="0"/>
+            <wp:docPr id="13" name="Εικόνα 13"/>
             <wp:cNvGraphicFramePr>
               <a:graphicFrameLocks xmlns:a="http://schemas.openxmlformats.org/drawingml/2006/main" noChangeAspect="1"/>
             </wp:cNvGraphicFramePr>
@@ -15156,7 +15019,7 @@
                   <pic:spPr>
                     <a:xfrm>
                       <a:off x="0" y="0"/>
-                      <a:ext cx="3657600" cy="1173480"/>
+                      <a:ext cx="3048000" cy="1188720"/>
                     </a:xfrm>
                     <a:prstGeom prst="rect">
                       <a:avLst/>
@@ -15172,41 +15035,45 @@
     <w:p>
       <w:pPr>
         <w:pStyle w:val="a7"/>
+      </w:pPr>
+      <w:bookmarkStart w:id="20" w:name="_Toc228198630"/>
+      <w:r>
+        <w:t xml:space="preserve">Στιγμιότυπο Εκτέλεσης </w:t>
+      </w:r>
+      <w:r>
+        <w:fldChar w:fldCharType="begin"/>
+      </w:r>
+      <w:r>
+        <w:instrText xml:space="preserve"> SEQ Στιγμιότυπο_Εκτέλεσης \* ARABIC </w:instrText>
+      </w:r>
+      <w:r>
+        <w:fldChar w:fldCharType="separate"/>
+      </w:r>
+      <w:r>
+        <w:rPr>
+          <w:noProof/>
+        </w:rPr>
+        <w:t>6</w:t>
+      </w:r>
+      <w:r>
+        <w:fldChar w:fldCharType="end"/>
+      </w:r>
+      <w:r>
+        <w:t xml:space="preserve"> </w:t>
+      </w:r>
+      <w:bookmarkStart w:id="21" w:name="_Toc228198507"/>
+      <w:r>
+        <w:t>Καρδίτσα</w:t>
+      </w:r>
+      <w:bookmarkEnd w:id="20"/>
+      <w:bookmarkEnd w:id="21"/>
+    </w:p>
+    <w:p>
+      <w:pPr>
         <w:rPr>
           <w:lang w:val="en-US"/>
         </w:rPr>
       </w:pPr>
-      <w:bookmarkStart w:id="23" w:name="_Toc228198632"/>
-      <w:r>
-        <w:t xml:space="preserve">Στιγμιότυπο Εκτέλεσης </w:t>
-      </w:r>
-      <w:r>
-        <w:fldChar w:fldCharType="begin"/>
-      </w:r>
-      <w:r>
-        <w:instrText xml:space="preserve"> SEQ Στιγμιότυπο_Εκτέλεσης \* ARABIC </w:instrText>
-      </w:r>
-      <w:r>
-        <w:fldChar w:fldCharType="separate"/>
-      </w:r>
-      <w:r>
-        <w:rPr>
-          <w:noProof/>
-        </w:rPr>
-        <w:t>8</w:t>
-      </w:r>
-      <w:r>
-        <w:fldChar w:fldCharType="end"/>
-      </w:r>
-      <w:r>
-        <w:t xml:space="preserve"> </w:t>
-      </w:r>
-      <w:bookmarkStart w:id="24" w:name="_Toc228198509"/>
-      <w:r>
-        <w:t>Ιωάννινα</w:t>
-      </w:r>
-      <w:bookmarkEnd w:id="23"/>
-      <w:bookmarkEnd w:id="24"/>
     </w:p>
     <w:p>
       <w:pPr>
@@ -15225,14 +15092,14 @@
           <w:b/>
           <w:sz w:val="28"/>
         </w:rPr>
-        <w:t>Χανιά</w:t>
+        <w:t>Πάτρα</w:t>
       </w:r>
       <w:r>
         <w:rPr>
           <w:b/>
           <w:sz w:val="28"/>
         </w:rPr>
-        <w:t xml:space="preserve"> (χωρίς πίνακα θερμοκρασίας)</w:t>
+        <w:t xml:space="preserve"> (με πίνακα θερμοκρασίας)</w:t>
       </w:r>
     </w:p>
     <w:p>
@@ -15247,10 +15114,10 @@
           <w:lang w:eastAsia="el-GR"/>
         </w:rPr>
         <w:drawing>
-          <wp:inline distT="0" distB="0" distL="0" distR="0" wp14:anchorId="76CC71F3" wp14:editId="1C3C5F21">
-            <wp:extent cx="3009900" cy="1181100"/>
+          <wp:inline distT="0" distB="0" distL="0" distR="0" wp14:anchorId="25747F2A" wp14:editId="013F2E53">
+            <wp:extent cx="4732020" cy="1188720"/>
             <wp:effectExtent l="0" t="0" r="0" b="0"/>
-            <wp:docPr id="16" name="Εικόνα 16"/>
+            <wp:docPr id="14" name="Εικόνα 14"/>
             <wp:cNvGraphicFramePr>
               <a:graphicFrameLocks xmlns:a="http://schemas.openxmlformats.org/drawingml/2006/main" noChangeAspect="1"/>
             </wp:cNvGraphicFramePr>
@@ -15270,6 +15137,231 @@
                   <pic:spPr>
                     <a:xfrm>
                       <a:off x="0" y="0"/>
+                      <a:ext cx="4732020" cy="1188720"/>
+                    </a:xfrm>
+                    <a:prstGeom prst="rect">
+                      <a:avLst/>
+                    </a:prstGeom>
+                  </pic:spPr>
+                </pic:pic>
+              </a:graphicData>
+            </a:graphic>
+          </wp:inline>
+        </w:drawing>
+      </w:r>
+    </w:p>
+    <w:p>
+      <w:pPr>
+        <w:pStyle w:val="a7"/>
+      </w:pPr>
+      <w:bookmarkStart w:id="22" w:name="_Toc228198631"/>
+      <w:r>
+        <w:t xml:space="preserve">Στιγμιότυπο Εκτέλεσης </w:t>
+      </w:r>
+      <w:r>
+        <w:fldChar w:fldCharType="begin"/>
+      </w:r>
+      <w:r>
+        <w:instrText xml:space="preserve"> SEQ Στιγμιότυπο_Εκτέλεσης \* ARABIC </w:instrText>
+      </w:r>
+      <w:r>
+        <w:fldChar w:fldCharType="separate"/>
+      </w:r>
+      <w:r>
+        <w:rPr>
+          <w:noProof/>
+        </w:rPr>
+        <w:t>7</w:t>
+      </w:r>
+      <w:r>
+        <w:fldChar w:fldCharType="end"/>
+      </w:r>
+      <w:r>
+        <w:t xml:space="preserve"> </w:t>
+      </w:r>
+      <w:bookmarkStart w:id="23" w:name="_Toc228198508"/>
+      <w:r>
+        <w:t>Πάτρα</w:t>
+      </w:r>
+      <w:bookmarkEnd w:id="22"/>
+      <w:bookmarkEnd w:id="23"/>
+    </w:p>
+    <w:p>
+      <w:pPr>
+        <w:pStyle w:val="a6"/>
+        <w:numPr>
+          <w:ilvl w:val="0"/>
+          <w:numId w:val="10"/>
+        </w:numPr>
+        <w:rPr>
+          <w:b/>
+          <w:sz w:val="28"/>
+        </w:rPr>
+      </w:pPr>
+      <w:r>
+        <w:rPr>
+          <w:b/>
+          <w:sz w:val="28"/>
+        </w:rPr>
+        <w:t>Ιωάννινα</w:t>
+      </w:r>
+      <w:r>
+        <w:rPr>
+          <w:b/>
+          <w:sz w:val="28"/>
+        </w:rPr>
+        <w:t xml:space="preserve"> (χωρίς πίνακα θερμοκρασίας)</w:t>
+      </w:r>
+    </w:p>
+    <w:p>
+      <w:pPr>
+        <w:pStyle w:val="a6"/>
+        <w:keepNext/>
+        <w:ind w:firstLine="0"/>
+      </w:pPr>
+      <w:r>
+        <w:rPr>
+          <w:noProof/>
+          <w:lang w:eastAsia="el-GR"/>
+        </w:rPr>
+        <w:drawing>
+          <wp:inline distT="0" distB="0" distL="0" distR="0" wp14:anchorId="6FE0E53D" wp14:editId="21C7531E">
+            <wp:extent cx="3657600" cy="1173480"/>
+            <wp:effectExtent l="0" t="0" r="0" b="7620"/>
+            <wp:docPr id="15" name="Εικόνα 15"/>
+            <wp:cNvGraphicFramePr>
+              <a:graphicFrameLocks xmlns:a="http://schemas.openxmlformats.org/drawingml/2006/main" noChangeAspect="1"/>
+            </wp:cNvGraphicFramePr>
+            <a:graphic xmlns:a="http://schemas.openxmlformats.org/drawingml/2006/main">
+              <a:graphicData uri="http://schemas.openxmlformats.org/drawingml/2006/picture">
+                <pic:pic xmlns:pic="http://schemas.openxmlformats.org/drawingml/2006/picture">
+                  <pic:nvPicPr>
+                    <pic:cNvPr id="0" name=""/>
+                    <pic:cNvPicPr/>
+                  </pic:nvPicPr>
+                  <pic:blipFill>
+                    <a:blip r:embed="rId19"/>
+                    <a:stretch>
+                      <a:fillRect/>
+                    </a:stretch>
+                  </pic:blipFill>
+                  <pic:spPr>
+                    <a:xfrm>
+                      <a:off x="0" y="0"/>
+                      <a:ext cx="3657600" cy="1173480"/>
+                    </a:xfrm>
+                    <a:prstGeom prst="rect">
+                      <a:avLst/>
+                    </a:prstGeom>
+                  </pic:spPr>
+                </pic:pic>
+              </a:graphicData>
+            </a:graphic>
+          </wp:inline>
+        </w:drawing>
+      </w:r>
+    </w:p>
+    <w:p>
+      <w:pPr>
+        <w:pStyle w:val="a7"/>
+        <w:rPr>
+          <w:lang w:val="en-US"/>
+        </w:rPr>
+      </w:pPr>
+      <w:bookmarkStart w:id="24" w:name="_Toc228198632"/>
+      <w:r>
+        <w:t xml:space="preserve">Στιγμιότυπο Εκτέλεσης </w:t>
+      </w:r>
+      <w:r>
+        <w:fldChar w:fldCharType="begin"/>
+      </w:r>
+      <w:r>
+        <w:instrText xml:space="preserve"> SEQ Στιγμιότυπο_Εκτέλεσης \* ARABIC </w:instrText>
+      </w:r>
+      <w:r>
+        <w:fldChar w:fldCharType="separate"/>
+      </w:r>
+      <w:r>
+        <w:rPr>
+          <w:noProof/>
+        </w:rPr>
+        <w:t>8</w:t>
+      </w:r>
+      <w:r>
+        <w:fldChar w:fldCharType="end"/>
+      </w:r>
+      <w:r>
+        <w:t xml:space="preserve"> </w:t>
+      </w:r>
+      <w:bookmarkStart w:id="25" w:name="_Toc228198509"/>
+      <w:r>
+        <w:t>Ιωάννινα</w:t>
+      </w:r>
+      <w:bookmarkEnd w:id="24"/>
+      <w:bookmarkEnd w:id="25"/>
+    </w:p>
+    <w:p>
+      <w:pPr>
+        <w:pStyle w:val="a6"/>
+        <w:numPr>
+          <w:ilvl w:val="0"/>
+          <w:numId w:val="10"/>
+        </w:numPr>
+        <w:rPr>
+          <w:b/>
+          <w:sz w:val="28"/>
+        </w:rPr>
+      </w:pPr>
+      <w:r>
+        <w:rPr>
+          <w:b/>
+          <w:sz w:val="28"/>
+        </w:rPr>
+        <w:t>Χανιά</w:t>
+      </w:r>
+      <w:r>
+        <w:rPr>
+          <w:b/>
+          <w:sz w:val="28"/>
+        </w:rPr>
+        <w:t xml:space="preserve"> (χωρίς πίνακα θερμοκρασίας)</w:t>
+      </w:r>
+    </w:p>
+    <w:p>
+      <w:pPr>
+        <w:pStyle w:val="a6"/>
+        <w:keepNext/>
+        <w:ind w:firstLine="0"/>
+      </w:pPr>
+      <w:r>
+        <w:rPr>
+          <w:noProof/>
+          <w:lang w:eastAsia="el-GR"/>
+        </w:rPr>
+        <w:drawing>
+          <wp:inline distT="0" distB="0" distL="0" distR="0" wp14:anchorId="76CC71F3" wp14:editId="1C3C5F21">
+            <wp:extent cx="3009900" cy="1181100"/>
+            <wp:effectExtent l="0" t="0" r="0" b="0"/>
+            <wp:docPr id="16" name="Εικόνα 16"/>
+            <wp:cNvGraphicFramePr>
+              <a:graphicFrameLocks xmlns:a="http://schemas.openxmlformats.org/drawingml/2006/main" noChangeAspect="1"/>
+            </wp:cNvGraphicFramePr>
+            <a:graphic xmlns:a="http://schemas.openxmlformats.org/drawingml/2006/main">
+              <a:graphicData uri="http://schemas.openxmlformats.org/drawingml/2006/picture">
+                <pic:pic xmlns:pic="http://schemas.openxmlformats.org/drawingml/2006/picture">
+                  <pic:nvPicPr>
+                    <pic:cNvPr id="0" name=""/>
+                    <pic:cNvPicPr/>
+                  </pic:nvPicPr>
+                  <pic:blipFill>
+                    <a:blip r:embed="rId20"/>
+                    <a:stretch>
+                      <a:fillRect/>
+                    </a:stretch>
+                  </pic:blipFill>
+                  <pic:spPr>
+                    <a:xfrm>
+                      <a:off x="0" y="0"/>
                       <a:ext cx="3009900" cy="1181100"/>
                     </a:xfrm>
                     <a:prstGeom prst="rect">
@@ -15287,7 +15379,7 @@
       <w:pPr>
         <w:pStyle w:val="a7"/>
       </w:pPr>
-      <w:bookmarkStart w:id="25" w:name="_Toc228198633"/>
+      <w:bookmarkStart w:id="26" w:name="_Toc228198633"/>
       <w:r>
         <w:t xml:space="preserve">Στιγμιότυπο Εκτέλεσης </w:t>
       </w:r>
@@ -15312,12 +15404,12 @@
       <w:r>
         <w:t xml:space="preserve"> </w:t>
       </w:r>
-      <w:bookmarkStart w:id="26" w:name="_Toc228198510"/>
+      <w:bookmarkStart w:id="27" w:name="_Toc228198510"/>
       <w:r>
         <w:t>Χανιά</w:t>
       </w:r>
-      <w:bookmarkEnd w:id="25"/>
       <w:bookmarkEnd w:id="26"/>
+      <w:bookmarkEnd w:id="27"/>
     </w:p>
     <w:p>
       <w:pPr>
@@ -15327,12 +15419,12 @@
           <w:numId w:val="3"/>
         </w:numPr>
       </w:pPr>
-      <w:bookmarkStart w:id="27" w:name="_Toc228197866"/>
+      <w:bookmarkStart w:id="28" w:name="_Toc228197866"/>
       <w:r>
         <w:lastRenderedPageBreak/>
         <w:t>Φάση Αξιολόγησης</w:t>
       </w:r>
-      <w:bookmarkEnd w:id="27"/>
+      <w:bookmarkEnd w:id="28"/>
     </w:p>
     <w:p>
       <w:pPr>
@@ -17658,7 +17750,7 @@
 </file>
 
 <file path=customXml/itemProps1.xml><?xml version="1.0" encoding="utf-8"?>
-<ds:datastoreItem xmlns:ds="http://schemas.openxmlformats.org/officeDocument/2006/customXml" ds:itemID="{4D20F95B-0DE0-4C54-B836-9EF9176F41BF}">
+<ds:datastoreItem xmlns:ds="http://schemas.openxmlformats.org/officeDocument/2006/customXml" ds:itemID="{37EF6CA9-686B-4C4D-84F7-278477F05C78}">
   <ds:schemaRefs>
     <ds:schemaRef ds:uri="http://schemas.openxmlformats.org/officeDocument/2006/bibliography"/>
   </ds:schemaRefs>

</xml_diff>

<commit_message>
LAST CHANGE WORD+ PDF
</commit_message>
<xml_diff>
--- a/Περιεχόμενα.docx
+++ b/Περιεχόμενα.docx
@@ -10,6 +10,7 @@
           <w:docPartUnique/>
         </w:docPartObj>
       </w:sdtPr>
+      <w:sdtEndPr/>
       <w:sdtContent>
         <w:p>
           <w:r>
@@ -20,7 +21,7 @@
             <mc:AlternateContent>
               <mc:Choice Requires="wps">
                 <w:drawing>
-                  <wp:anchor distT="0" distB="0" distL="114300" distR="114300" simplePos="0" relativeHeight="251660288" behindDoc="1" locked="0" layoutInCell="1" allowOverlap="1" wp14:anchorId="49E2476C" wp14:editId="08DAD44D">
+                  <wp:anchor distT="0" distB="0" distL="114300" distR="114300" simplePos="0" relativeHeight="251660288" behindDoc="1" locked="0" layoutInCell="1" allowOverlap="1" wp14:anchorId="0F73FDF2" wp14:editId="6FE1ED0D">
                     <wp:simplePos x="0" y="0"/>
                     <wp:positionH relativeFrom="margin">
                       <wp:align>center</wp:align>
@@ -88,16 +89,18 @@
                                     <w:lang w:val="en-US"/>
                                   </w:rPr>
                                   <w:alias w:val="Τίτλος"/>
-                                  <w:id w:val="1550341699"/>
+                                  <w:id w:val="612108327"/>
                                   <w:dataBinding w:prefixMappings="xmlns:ns0='http://schemas.openxmlformats.org/package/2006/metadata/core-properties' xmlns:ns1='http://purl.org/dc/elements/1.1/'" w:xpath="/ns0:coreProperties[1]/ns1:title[1]" w:storeItemID="{6C3C8BC8-F283-45AE-878A-BAB7291924A1}"/>
                                   <w:text/>
                                 </w:sdtPr>
+                                <w:sdtEndPr/>
                                 <w:sdtContent>
                                   <w:p>
                                     <w:pPr>
                                       <w:pStyle w:val="a3"/>
                                       <w:spacing w:after="240" w:line="360" w:lineRule="auto"/>
                                       <w:ind w:firstLine="0"/>
+                                      <w:jc w:val="left"/>
                                       <w:rPr>
                                         <w:rFonts w:asciiTheme="majorHAnsi" w:eastAsiaTheme="majorEastAsia" w:hAnsiTheme="majorHAnsi" w:cstheme="majorBidi"/>
                                         <w:color w:val="FFFFFF" w:themeColor="background1"/>
@@ -114,40 +117,7 @@
                                         <w:szCs w:val="84"/>
                                         <w:lang w:val="en-US"/>
                                       </w:rPr>
-                                      <w:t xml:space="preserve">City Data Scrapping With </w:t>
-                                    </w:r>
-                                    <w:proofErr w:type="spellStart"/>
-                                    <w:r>
-                                      <w:rPr>
-                                        <w:rFonts w:asciiTheme="majorHAnsi" w:eastAsiaTheme="majorEastAsia" w:hAnsiTheme="majorHAnsi" w:cstheme="majorBidi"/>
-                                        <w:color w:val="FFFFFF" w:themeColor="background1"/>
-                                        <w:sz w:val="84"/>
-                                        <w:szCs w:val="84"/>
-                                        <w:lang w:val="en-US"/>
-                                      </w:rPr>
-                                      <w:t>Pythoν</w:t>
-                                    </w:r>
-                                    <w:proofErr w:type="spellEnd"/>
-                                    <w:r>
-                                      <w:rPr>
-                                        <w:rFonts w:asciiTheme="majorHAnsi" w:eastAsiaTheme="majorEastAsia" w:hAnsiTheme="majorHAnsi" w:cstheme="majorBidi"/>
-                                        <w:color w:val="FFFFFF" w:themeColor="background1"/>
-                                        <w:sz w:val="84"/>
-                                        <w:szCs w:val="84"/>
-                                        <w:lang w:val="en-US"/>
-                                      </w:rPr>
-                                      <w:t xml:space="preserve"> </w:t>
-                                    </w:r>
-                                    <w:proofErr w:type="gramStart"/>
-                                    <w:r>
-                                      <w:rPr>
-                                        <w:rFonts w:asciiTheme="majorHAnsi" w:eastAsiaTheme="majorEastAsia" w:hAnsiTheme="majorHAnsi" w:cstheme="majorBidi"/>
-                                        <w:color w:val="FFFFFF" w:themeColor="background1"/>
-                                        <w:sz w:val="84"/>
-                                        <w:szCs w:val="84"/>
-                                        <w:lang w:val="en-US"/>
-                                      </w:rPr>
-                                      <w:t>Regular  Expre</w:t>
+                                      <w:t xml:space="preserve">City Data Scrapping With Python Regular </w:t>
                                     </w:r>
                                     <w:r>
                                       <w:rPr>
@@ -157,50 +127,7 @@
                                         <w:szCs w:val="84"/>
                                         <w:lang w:val="en-US"/>
                                       </w:rPr>
-                                      <w:t>s</w:t>
-                                    </w:r>
-                                    <w:r>
-                                      <w:rPr>
-                                        <w:rFonts w:asciiTheme="majorHAnsi" w:eastAsiaTheme="majorEastAsia" w:hAnsiTheme="majorHAnsi" w:cstheme="majorBidi"/>
-                                        <w:color w:val="FFFFFF" w:themeColor="background1"/>
-                                        <w:sz w:val="84"/>
-                                        <w:szCs w:val="84"/>
-                                        <w:lang w:val="en-US"/>
-                                      </w:rPr>
-                                      <w:t>sions</w:t>
-                                    </w:r>
-                                    <w:proofErr w:type="gramEnd"/>
-                                    <w:r>
-                                      <w:rPr>
-                                        <w:rFonts w:asciiTheme="majorHAnsi" w:eastAsiaTheme="majorEastAsia" w:hAnsiTheme="majorHAnsi" w:cstheme="majorBidi"/>
-                                        <w:color w:val="FFFFFF" w:themeColor="background1"/>
-                                        <w:sz w:val="84"/>
-                                        <w:szCs w:val="84"/>
-                                        <w:lang w:val="en-US"/>
-                                      </w:rPr>
-                                      <w:t>(</w:t>
-                                    </w:r>
-                                    <w:proofErr w:type="spellStart"/>
-                                    <w:r>
-                                      <w:rPr>
-                                        <w:rFonts w:asciiTheme="majorHAnsi" w:eastAsiaTheme="majorEastAsia" w:hAnsiTheme="majorHAnsi" w:cstheme="majorBidi"/>
-                                        <w:color w:val="FFFFFF" w:themeColor="background1"/>
-                                        <w:sz w:val="84"/>
-                                        <w:szCs w:val="84"/>
-                                        <w:lang w:val="en-US"/>
-                                      </w:rPr>
-                                      <w:t>REmodulε</w:t>
-                                    </w:r>
-                                    <w:proofErr w:type="spellEnd"/>
-                                    <w:r>
-                                      <w:rPr>
-                                        <w:rFonts w:asciiTheme="majorHAnsi" w:eastAsiaTheme="majorEastAsia" w:hAnsiTheme="majorHAnsi" w:cstheme="majorBidi"/>
-                                        <w:color w:val="FFFFFF" w:themeColor="background1"/>
-                                        <w:sz w:val="84"/>
-                                        <w:szCs w:val="84"/>
-                                        <w:lang w:val="en-US"/>
-                                      </w:rPr>
-                                      <w:t>)</w:t>
+                                      <w:t>Expressions</w:t>
                                     </w:r>
                                   </w:p>
                                 </w:sdtContent>
@@ -238,7 +165,7 @@
                               <w:lang w:val="en-US"/>
                             </w:rPr>
                             <w:alias w:val="Τίτλος"/>
-                            <w:id w:val="1550341699"/>
+                            <w:id w:val="612108327"/>
                             <w:dataBinding w:prefixMappings="xmlns:ns0='http://schemas.openxmlformats.org/package/2006/metadata/core-properties' xmlns:ns1='http://purl.org/dc/elements/1.1/'" w:xpath="/ns0:coreProperties[1]/ns1:title[1]" w:storeItemID="{6C3C8BC8-F283-45AE-878A-BAB7291924A1}"/>
                             <w:text/>
                           </w:sdtPr>
@@ -248,6 +175,7 @@
                                 <w:pStyle w:val="a3"/>
                                 <w:spacing w:after="240" w:line="360" w:lineRule="auto"/>
                                 <w:ind w:firstLine="0"/>
+                                <w:jc w:val="left"/>
                                 <w:rPr>
                                   <w:rFonts w:asciiTheme="majorHAnsi" w:eastAsiaTheme="majorEastAsia" w:hAnsiTheme="majorHAnsi" w:cstheme="majorBidi"/>
                                   <w:color w:val="FFFFFF" w:themeColor="background1"/>
@@ -264,9 +192,8 @@
                                   <w:szCs w:val="84"/>
                                   <w:lang w:val="en-US"/>
                                 </w:rPr>
-                                <w:t xml:space="preserve">City Data Scrapping With </w:t>
+                                <w:t xml:space="preserve">City Data Scrapping With Python Regular </w:t>
                               </w:r>
-                              <w:proofErr w:type="spellStart"/>
                               <w:r>
                                 <w:rPr>
                                   <w:rFonts w:asciiTheme="majorHAnsi" w:eastAsiaTheme="majorEastAsia" w:hAnsiTheme="majorHAnsi" w:cstheme="majorBidi"/>
@@ -275,29 +202,7 @@
                                   <w:szCs w:val="84"/>
                                   <w:lang w:val="en-US"/>
                                 </w:rPr>
-                                <w:t>Pythoν</w:t>
-                              </w:r>
-                              <w:proofErr w:type="spellEnd"/>
-                              <w:r>
-                                <w:rPr>
-                                  <w:rFonts w:asciiTheme="majorHAnsi" w:eastAsiaTheme="majorEastAsia" w:hAnsiTheme="majorHAnsi" w:cstheme="majorBidi"/>
-                                  <w:color w:val="FFFFFF" w:themeColor="background1"/>
-                                  <w:sz w:val="84"/>
-                                  <w:szCs w:val="84"/>
-                                  <w:lang w:val="en-US"/>
-                                </w:rPr>
-                                <w:t xml:space="preserve"> </w:t>
-                              </w:r>
-                              <w:proofErr w:type="gramStart"/>
-                              <w:r>
-                                <w:rPr>
-                                  <w:rFonts w:asciiTheme="majorHAnsi" w:eastAsiaTheme="majorEastAsia" w:hAnsiTheme="majorHAnsi" w:cstheme="majorBidi"/>
-                                  <w:color w:val="FFFFFF" w:themeColor="background1"/>
-                                  <w:sz w:val="84"/>
-                                  <w:szCs w:val="84"/>
-                                  <w:lang w:val="en-US"/>
-                                </w:rPr>
-                                <w:t>Regular  Expre</w:t>
+                                <w:t>Expre</w:t>
                               </w:r>
                               <w:r>
                                 <w:rPr>
@@ -318,39 +223,6 @@
                                   <w:lang w:val="en-US"/>
                                 </w:rPr>
                                 <w:t>sions</w:t>
-                              </w:r>
-                              <w:proofErr w:type="gramEnd"/>
-                              <w:r>
-                                <w:rPr>
-                                  <w:rFonts w:asciiTheme="majorHAnsi" w:eastAsiaTheme="majorEastAsia" w:hAnsiTheme="majorHAnsi" w:cstheme="majorBidi"/>
-                                  <w:color w:val="FFFFFF" w:themeColor="background1"/>
-                                  <w:sz w:val="84"/>
-                                  <w:szCs w:val="84"/>
-                                  <w:lang w:val="en-US"/>
-                                </w:rPr>
-                                <w:t>(</w:t>
-                              </w:r>
-                              <w:proofErr w:type="spellStart"/>
-                              <w:r>
-                                <w:rPr>
-                                  <w:rFonts w:asciiTheme="majorHAnsi" w:eastAsiaTheme="majorEastAsia" w:hAnsiTheme="majorHAnsi" w:cstheme="majorBidi"/>
-                                  <w:color w:val="FFFFFF" w:themeColor="background1"/>
-                                  <w:sz w:val="84"/>
-                                  <w:szCs w:val="84"/>
-                                  <w:lang w:val="en-US"/>
-                                </w:rPr>
-                                <w:t>REmodulε</w:t>
-                              </w:r>
-                              <w:proofErr w:type="spellEnd"/>
-                              <w:r>
-                                <w:rPr>
-                                  <w:rFonts w:asciiTheme="majorHAnsi" w:eastAsiaTheme="majorEastAsia" w:hAnsiTheme="majorHAnsi" w:cstheme="majorBidi"/>
-                                  <w:color w:val="FFFFFF" w:themeColor="background1"/>
-                                  <w:sz w:val="84"/>
-                                  <w:szCs w:val="84"/>
-                                  <w:lang w:val="en-US"/>
-                                </w:rPr>
-                                <w:t>)</w:t>
                               </w:r>
                             </w:p>
                           </w:sdtContent>
@@ -376,7 +248,7 @@
             <mc:AlternateContent>
               <mc:Choice Requires="wps">
                 <w:drawing>
-                  <wp:anchor distT="0" distB="0" distL="114300" distR="114300" simplePos="0" relativeHeight="251662336" behindDoc="0" locked="0" layoutInCell="1" allowOverlap="1" wp14:anchorId="4E0F4E30" wp14:editId="3C375477">
+                  <wp:anchor distT="0" distB="0" distL="114300" distR="114300" simplePos="0" relativeHeight="251662336" behindDoc="0" locked="0" layoutInCell="1" allowOverlap="1" wp14:anchorId="4CB48FB1" wp14:editId="45F95397">
                     <wp:simplePos x="0" y="0"/>
                     <mc:AlternateContent>
                       <mc:Choice Requires="wp14">
@@ -514,7 +386,7 @@
             <mc:AlternateContent>
               <mc:Choice Requires="wps">
                 <w:drawing>
-                  <wp:anchor distT="0" distB="0" distL="114300" distR="114300" simplePos="0" relativeHeight="251663360" behindDoc="0" locked="0" layoutInCell="1" allowOverlap="1" wp14:anchorId="31B02895" wp14:editId="4E119D51">
+                  <wp:anchor distT="0" distB="0" distL="114300" distR="114300" simplePos="0" relativeHeight="251663360" behindDoc="0" locked="0" layoutInCell="1" allowOverlap="1" wp14:anchorId="09089CFA" wp14:editId="2A7AE37C">
                     <wp:simplePos x="0" y="0"/>
                     <mc:AlternateContent>
                       <mc:Choice Requires="wp14">
@@ -809,7 +681,6 @@
                                   <w:rPr>
                                     <w:sz w:val="22"/>
                                     <w:szCs w:val="22"/>
-                                    <w:lang w:val="en-US"/>
                                   </w:rPr>
                                 </w:pPr>
                                 <w:r>
@@ -848,34 +719,50 @@
                                     <w:lang w:val="en-US"/>
                                   </w:rPr>
                                 </w:pPr>
-                                <w:hyperlink r:id="rId7" w:history="1">
-                                  <w:proofErr w:type="spellStart"/>
-                                  <w:r>
-                                    <w:rPr>
-                                      <w:rStyle w:val="-"/>
-                                      <w:b/>
-                                      <w:bCs/>
-                                      <w:sz w:val="22"/>
-                                      <w:szCs w:val="22"/>
-                                      <w:lang w:val="en-US"/>
-                                    </w:rPr>
-                                    <w:t>Github</w:t>
-                                  </w:r>
-                                  <w:proofErr w:type="spellEnd"/>
-                                  <w:r>
-                                    <w:rPr>
-                                      <w:rStyle w:val="-"/>
-                                      <w:b/>
-                                      <w:bCs/>
-                                      <w:sz w:val="22"/>
-                                      <w:szCs w:val="22"/>
-                                      <w:lang w:val="en-US"/>
-                                    </w:rPr>
-                                    <w:t xml:space="preserve"> Repository</w:t>
-                                  </w:r>
-                                </w:hyperlink>
-                                <w:bookmarkStart w:id="0" w:name="_GoBack"/>
-                                <w:bookmarkEnd w:id="0"/>
+                                <w:r>
+                                  <w:fldChar w:fldCharType="begin"/>
+                                </w:r>
+                                <w:r>
+                                  <w:instrText xml:space="preserve"> HYPERLINK "https://github.com/vasilismanthelas2004/re" </w:instrText>
+                                </w:r>
+                                <w:r>
+                                  <w:fldChar w:fldCharType="separate"/>
+                                </w:r>
+                                <w:proofErr w:type="spellStart"/>
+                                <w:r>
+                                  <w:rPr>
+                                    <w:rStyle w:val="-"/>
+                                    <w:b/>
+                                    <w:bCs/>
+                                    <w:sz w:val="22"/>
+                                    <w:szCs w:val="22"/>
+                                    <w:lang w:val="en-US"/>
+                                  </w:rPr>
+                                  <w:t>Github</w:t>
+                                </w:r>
+                                <w:proofErr w:type="spellEnd"/>
+                                <w:r>
+                                  <w:rPr>
+                                    <w:rStyle w:val="-"/>
+                                    <w:b/>
+                                    <w:bCs/>
+                                    <w:sz w:val="22"/>
+                                    <w:szCs w:val="22"/>
+                                    <w:lang w:val="en-US"/>
+                                  </w:rPr>
+                                  <w:t xml:space="preserve"> Repository</w:t>
+                                </w:r>
+                                <w:r>
+                                  <w:rPr>
+                                    <w:rStyle w:val="-"/>
+                                    <w:b/>
+                                    <w:bCs/>
+                                    <w:sz w:val="22"/>
+                                    <w:szCs w:val="22"/>
+                                    <w:lang w:val="en-US"/>
+                                  </w:rPr>
+                                  <w:fldChar w:fldCharType="end"/>
+                                </w:r>
                               </w:p>
                               <w:p>
                                 <w:pPr>
@@ -1213,8 +1100,6 @@
                               <w:t xml:space="preserve"> Repository</w:t>
                             </w:r>
                           </w:hyperlink>
-                          <w:bookmarkStart w:id="1" w:name="_GoBack"/>
-                          <w:bookmarkEnd w:id="1"/>
                         </w:p>
                         <w:p>
                           <w:pPr>
@@ -1248,7 +1133,7 @@
             <mc:AlternateContent>
               <mc:Choice Requires="wps">
                 <w:drawing>
-                  <wp:anchor distT="0" distB="0" distL="114300" distR="114300" simplePos="0" relativeHeight="251659264" behindDoc="1" locked="0" layoutInCell="1" allowOverlap="1" wp14:anchorId="14CD0751" wp14:editId="189E6E91">
+                  <wp:anchor distT="0" distB="0" distL="114300" distR="114300" simplePos="0" relativeHeight="251659264" behindDoc="1" locked="0" layoutInCell="1" allowOverlap="1" wp14:anchorId="4775DC85" wp14:editId="0F99B74E">
                     <wp:simplePos x="0" y="0"/>
                     <wp:positionH relativeFrom="margin">
                       <wp:align>center</wp:align>
@@ -1338,7 +1223,7 @@
             <mc:AlternateContent>
               <mc:Choice Requires="wpg">
                 <w:drawing>
-                  <wp:anchor distT="0" distB="0" distL="114300" distR="114300" simplePos="0" relativeHeight="251661312" behindDoc="0" locked="0" layoutInCell="1" allowOverlap="1" wp14:anchorId="110476BD" wp14:editId="734BDDC4">
+                  <wp:anchor distT="0" distB="0" distL="114300" distR="114300" simplePos="0" relativeHeight="251661312" behindDoc="0" locked="0" layoutInCell="1" allowOverlap="1" wp14:anchorId="3D5722D1" wp14:editId="52DF8F5B">
                     <wp:simplePos x="0" y="0"/>
                     <mc:AlternateContent>
                       <mc:Choice Requires="wp14">
@@ -2816,7 +2701,7 @@
                 <w:noProof/>
                 <w:webHidden/>
               </w:rPr>
-              <w:t>7</w:t>
+              <w:t>6</w:t>
             </w:r>
             <w:r>
               <w:rPr>
@@ -3160,12 +3045,12 @@
           <w:numId w:val="3"/>
         </w:numPr>
       </w:pPr>
-      <w:bookmarkStart w:id="2" w:name="_Toc228197858"/>
+      <w:bookmarkStart w:id="0" w:name="_Toc228197858"/>
       <w:r>
         <w:lastRenderedPageBreak/>
         <w:t>Εισαγωγή</w:t>
       </w:r>
-      <w:bookmarkEnd w:id="2"/>
+      <w:bookmarkEnd w:id="0"/>
     </w:p>
     <w:p>
       <w:pPr>
@@ -3240,19 +3125,7 @@
         <w:rPr>
           <w:szCs w:val="24"/>
         </w:rPr>
-        <w:t>που αφορούν διάφορες πόλεις του κόσμου. Για την υλοποίηση θα χρησιμοποιήσουμε τις παρακάτω βιβλιοθ</w:t>
-      </w:r>
-      <w:r>
-        <w:rPr>
-          <w:szCs w:val="24"/>
-        </w:rPr>
-        <w:t>ή</w:t>
-      </w:r>
-      <w:r>
-        <w:rPr>
-          <w:szCs w:val="24"/>
-        </w:rPr>
-        <w:t xml:space="preserve">κες της </w:t>
+        <w:t xml:space="preserve">που αφορούν διάφορες πόλεις του κόσμου. Για την υλοποίηση θα χρησιμοποιήσουμε τις παρακάτω βιβλιοθήκες της </w:t>
       </w:r>
       <w:r>
         <w:rPr>
@@ -3349,19 +3222,7 @@
         <w:rPr>
           <w:szCs w:val="24"/>
         </w:rPr>
-        <w:t>για την εξαγωγή, την μορφοποίηση και την αν</w:t>
-      </w:r>
-      <w:r>
-        <w:rPr>
-          <w:szCs w:val="24"/>
-        </w:rPr>
-        <w:t>ά</w:t>
-      </w:r>
-      <w:r>
-        <w:rPr>
-          <w:szCs w:val="24"/>
-        </w:rPr>
-        <w:t>λυση</w:t>
+        <w:t>για την εξαγωγή, την μορφοποίηση και την ανάλυση</w:t>
       </w:r>
       <w:r>
         <w:rPr>
@@ -3384,11 +3245,11 @@
           <w:numId w:val="3"/>
         </w:numPr>
       </w:pPr>
-      <w:bookmarkStart w:id="3" w:name="_Toc228197859"/>
+      <w:bookmarkStart w:id="1" w:name="_Toc228197859"/>
       <w:r>
         <w:t>Μεθοδολογία και Εργαλεία Υλοποίησης</w:t>
       </w:r>
-      <w:bookmarkEnd w:id="3"/>
+      <w:bookmarkEnd w:id="1"/>
     </w:p>
     <w:p>
       <w:r>
@@ -3446,19 +3307,7 @@
         <w:rPr>
           <w:sz w:val="22"/>
         </w:rPr>
-        <w:t xml:space="preserve"> σε μο</w:t>
-      </w:r>
-      <w:r>
-        <w:rPr>
-          <w:sz w:val="22"/>
-        </w:rPr>
-        <w:t>ρ</w:t>
-      </w:r>
-      <w:r>
-        <w:rPr>
-          <w:sz w:val="22"/>
-        </w:rPr>
-        <w:t xml:space="preserve">φή </w:t>
+        <w:t xml:space="preserve"> σε μορφή </w:t>
       </w:r>
       <w:r>
         <w:rPr>
@@ -3616,11 +3465,11 @@
           <w:lang w:val="en-US"/>
         </w:rPr>
       </w:pPr>
-      <w:bookmarkStart w:id="4" w:name="_Toc228197860"/>
+      <w:bookmarkStart w:id="2" w:name="_Toc228197860"/>
       <w:r>
         <w:t>Περιγραφή Κώδικα</w:t>
       </w:r>
-      <w:bookmarkEnd w:id="4"/>
+      <w:bookmarkEnd w:id="2"/>
     </w:p>
     <w:p>
       <w:r>
@@ -3664,7 +3513,7 @@
           <w:numId w:val="3"/>
         </w:numPr>
       </w:pPr>
-      <w:bookmarkStart w:id="5" w:name="_Toc228197861"/>
+      <w:bookmarkStart w:id="3" w:name="_Toc228197861"/>
       <w:r>
         <w:t xml:space="preserve">Κλάση </w:t>
       </w:r>
@@ -3675,7 +3524,7 @@
         </w:rPr>
         <w:t>scraperPage</w:t>
       </w:r>
-      <w:bookmarkEnd w:id="5"/>
+      <w:bookmarkEnd w:id="3"/>
       <w:proofErr w:type="spellEnd"/>
     </w:p>
     <w:p>
@@ -5451,6 +5300,9 @@
     <w:p>
       <w:pPr>
         <w:ind w:left="360" w:firstLine="360"/>
+        <w:rPr>
+          <w:lang w:val="en-US"/>
+        </w:rPr>
       </w:pPr>
     </w:p>
     <w:p>
@@ -5464,7 +5316,7 @@
           <w:lang w:val="en-US"/>
         </w:rPr>
       </w:pPr>
-      <w:bookmarkStart w:id="6" w:name="_Toc228197862"/>
+      <w:bookmarkStart w:id="4" w:name="_Toc228197862"/>
       <w:r>
         <w:t xml:space="preserve">Κλάση </w:t>
       </w:r>
@@ -5474,7 +5326,7 @@
         </w:rPr>
         <w:t>Find</w:t>
       </w:r>
-      <w:bookmarkEnd w:id="6"/>
+      <w:bookmarkEnd w:id="4"/>
     </w:p>
     <w:p>
       <w:r>
@@ -9677,7 +9529,7 @@
           <w:color w:val="BBBEBF"/>
           <w:sz w:val="21"/>
           <w:szCs w:val="21"/>
-          <w:lang w:eastAsia="el-GR"/>
+          <w:lang w:val="en-US" w:eastAsia="el-GR"/>
         </w:rPr>
       </w:pPr>
       <w:r>
@@ -9690,40 +9542,38 @@
         </w:rPr>
         <w:t xml:space="preserve">            </w:t>
       </w:r>
-      <w:proofErr w:type="spellStart"/>
+      <w:proofErr w:type="gramStart"/>
       <w:r>
         <w:rPr>
           <w:rFonts w:ascii="Consolas" w:eastAsia="Times New Roman" w:hAnsi="Consolas" w:cs="Times New Roman"/>
           <w:color w:val="C586C0"/>
           <w:sz w:val="21"/>
           <w:szCs w:val="21"/>
-          <w:lang w:eastAsia="el-GR"/>
+          <w:lang w:val="en-US" w:eastAsia="el-GR"/>
         </w:rPr>
         <w:t>return</w:t>
       </w:r>
-      <w:proofErr w:type="spellEnd"/>
-      <w:r>
-        <w:rPr>
-          <w:rFonts w:ascii="Consolas" w:eastAsia="Times New Roman" w:hAnsi="Consolas" w:cs="Times New Roman"/>
-          <w:color w:val="BBBEBF"/>
-          <w:sz w:val="21"/>
-          <w:szCs w:val="21"/>
-          <w:lang w:eastAsia="el-GR"/>
+      <w:proofErr w:type="gramEnd"/>
+      <w:r>
+        <w:rPr>
+          <w:rFonts w:ascii="Consolas" w:eastAsia="Times New Roman" w:hAnsi="Consolas" w:cs="Times New Roman"/>
+          <w:color w:val="BBBEBF"/>
+          <w:sz w:val="21"/>
+          <w:szCs w:val="21"/>
+          <w:lang w:val="en-US" w:eastAsia="el-GR"/>
         </w:rPr>
         <w:t xml:space="preserve"> </w:t>
       </w:r>
-      <w:proofErr w:type="spellStart"/>
       <w:r>
         <w:rPr>
           <w:rFonts w:ascii="Consolas" w:eastAsia="Times New Roman" w:hAnsi="Consolas" w:cs="Times New Roman"/>
           <w:color w:val="569CD6"/>
           <w:sz w:val="21"/>
           <w:szCs w:val="21"/>
-          <w:lang w:eastAsia="el-GR"/>
+          <w:lang w:val="en-US" w:eastAsia="el-GR"/>
         </w:rPr>
         <w:t>None</w:t>
       </w:r>
-      <w:proofErr w:type="spellEnd"/>
     </w:p>
     <w:p>
       <w:pPr>
@@ -14224,6 +14074,9 @@
     <w:p>
       <w:pPr>
         <w:ind w:firstLine="0"/>
+        <w:rPr>
+          <w:lang w:val="en-US"/>
+        </w:rPr>
       </w:pPr>
     </w:p>
     <w:p>
@@ -14234,12 +14087,12 @@
           <w:numId w:val="3"/>
         </w:numPr>
       </w:pPr>
-      <w:bookmarkStart w:id="7" w:name="_Toc228197863"/>
+      <w:bookmarkStart w:id="5" w:name="_Toc228197863"/>
       <w:r>
         <w:lastRenderedPageBreak/>
         <w:t>Πειραματική Διαδικασία και Αξιολόγηση Αποτελεσμάτων</w:t>
       </w:r>
-      <w:bookmarkEnd w:id="7"/>
+      <w:bookmarkEnd w:id="5"/>
     </w:p>
     <w:p>
       <w:pPr>
@@ -14249,11 +14102,11 @@
           <w:numId w:val="3"/>
         </w:numPr>
       </w:pPr>
-      <w:bookmarkStart w:id="8" w:name="_Toc228197864"/>
+      <w:bookmarkStart w:id="6" w:name="_Toc228197864"/>
       <w:r>
         <w:t>Φάση Ανάπτυξης</w:t>
       </w:r>
-      <w:bookmarkEnd w:id="8"/>
+      <w:bookmarkEnd w:id="6"/>
     </w:p>
     <w:p>
       <w:r>
@@ -14333,6 +14186,43 @@
       <w:r>
         <w:t>πόλεις.</w:t>
       </w:r>
+    </w:p>
+    <w:p>
+      <w:pPr>
+        <w:pStyle w:val="a7"/>
+        <w:jc w:val="left"/>
+      </w:pPr>
+      <w:bookmarkStart w:id="7" w:name="_Toc228198625"/>
+      <w:r>
+        <w:t xml:space="preserve">Στιγμιότυπο Εκτέλεσης </w:t>
+      </w:r>
+      <w:r>
+        <w:fldChar w:fldCharType="begin"/>
+      </w:r>
+      <w:r>
+        <w:instrText xml:space="preserve"> SEQ Στιγμιότυπο_Εκτέλεσης \* ARABIC </w:instrText>
+      </w:r>
+      <w:r>
+        <w:fldChar w:fldCharType="separate"/>
+      </w:r>
+      <w:r>
+        <w:rPr>
+          <w:noProof/>
+        </w:rPr>
+        <w:t>1</w:t>
+      </w:r>
+      <w:r>
+        <w:fldChar w:fldCharType="end"/>
+      </w:r>
+      <w:r>
+        <w:t xml:space="preserve"> </w:t>
+      </w:r>
+      <w:bookmarkStart w:id="8" w:name="_Toc228198502"/>
+      <w:r>
+        <w:t>Αθήνα</w:t>
+      </w:r>
+      <w:bookmarkEnd w:id="7"/>
+      <w:bookmarkEnd w:id="8"/>
     </w:p>
     <w:p>
       <w:pPr>
@@ -14385,43 +14275,6 @@
     </w:p>
     <w:p>
       <w:pPr>
-        <w:pStyle w:val="a7"/>
-        <w:jc w:val="left"/>
-      </w:pPr>
-      <w:bookmarkStart w:id="9" w:name="_Toc228198625"/>
-      <w:r>
-        <w:t xml:space="preserve">Στιγμιότυπο Εκτέλεσης </w:t>
-      </w:r>
-      <w:r>
-        <w:fldChar w:fldCharType="begin"/>
-      </w:r>
-      <w:r>
-        <w:instrText xml:space="preserve"> SEQ Στιγμιότυπο_Εκτέλεσης \* ARABIC </w:instrText>
-      </w:r>
-      <w:r>
-        <w:fldChar w:fldCharType="separate"/>
-      </w:r>
-      <w:r>
-        <w:rPr>
-          <w:noProof/>
-        </w:rPr>
-        <w:t>1</w:t>
-      </w:r>
-      <w:r>
-        <w:fldChar w:fldCharType="end"/>
-      </w:r>
-      <w:r>
-        <w:t xml:space="preserve"> </w:t>
-      </w:r>
-      <w:bookmarkStart w:id="10" w:name="_Toc228198502"/>
-      <w:r>
-        <w:t>Αθήνα</w:t>
-      </w:r>
-      <w:bookmarkEnd w:id="9"/>
-      <w:bookmarkEnd w:id="10"/>
-    </w:p>
-    <w:p>
-      <w:pPr>
         <w:pStyle w:val="a6"/>
         <w:numPr>
           <w:ilvl w:val="0"/>
@@ -14494,6 +14347,64 @@
     <w:p>
       <w:pPr>
         <w:pStyle w:val="a6"/>
+        <w:ind w:firstLine="0"/>
+      </w:pPr>
+    </w:p>
+    <w:p>
+      <w:pPr>
+        <w:pStyle w:val="a6"/>
+        <w:ind w:firstLine="0"/>
+      </w:pPr>
+    </w:p>
+    <w:p>
+      <w:pPr>
+        <w:pStyle w:val="a6"/>
+        <w:ind w:firstLine="0"/>
+      </w:pPr>
+    </w:p>
+    <w:p>
+      <w:pPr>
+        <w:pStyle w:val="a7"/>
+        <w:rPr>
+          <w:lang w:val="en-US"/>
+        </w:rPr>
+      </w:pPr>
+      <w:bookmarkStart w:id="9" w:name="_Toc228198626"/>
+      <w:r>
+        <w:lastRenderedPageBreak/>
+        <w:t xml:space="preserve">Στιγμιότυπο Εκτέλεσης </w:t>
+      </w:r>
+      <w:r>
+        <w:fldChar w:fldCharType="begin"/>
+      </w:r>
+      <w:r>
+        <w:instrText xml:space="preserve"> SEQ Στιγμιότυπο_Εκτέλεσης \* ARABIC </w:instrText>
+      </w:r>
+      <w:r>
+        <w:fldChar w:fldCharType="separate"/>
+      </w:r>
+      <w:r>
+        <w:rPr>
+          <w:noProof/>
+        </w:rPr>
+        <w:t>2</w:t>
+      </w:r>
+      <w:r>
+        <w:fldChar w:fldCharType="end"/>
+      </w:r>
+      <w:r>
+        <w:t xml:space="preserve"> </w:t>
+      </w:r>
+      <w:bookmarkStart w:id="10" w:name="_Toc228198503"/>
+      <w:r>
+        <w:t>Θεσσαλονίκη</w:t>
+      </w:r>
+      <w:bookmarkEnd w:id="9"/>
+      <w:bookmarkEnd w:id="10"/>
+    </w:p>
+    <w:p>
+      <w:pPr>
+        <w:pStyle w:val="a6"/>
         <w:keepNext/>
         <w:ind w:firstLine="0"/>
       </w:pPr>
@@ -14502,9 +14413,8 @@
           <w:noProof/>
           <w:lang w:eastAsia="el-GR"/>
         </w:rPr>
-        <w:lastRenderedPageBreak/>
         <w:drawing>
-          <wp:inline distT="0" distB="0" distL="0" distR="0" wp14:anchorId="0C70D5C4" wp14:editId="5FC58150">
+          <wp:inline distT="0" distB="0" distL="0" distR="0" wp14:anchorId="6A3D255D" wp14:editId="46CF3F92">
             <wp:extent cx="4693920" cy="1181100"/>
             <wp:effectExtent l="0" t="0" r="0" b="0"/>
             <wp:docPr id="1" name="Εικόνα 1"/>
@@ -14542,54 +14452,6 @@
     </w:p>
     <w:p>
       <w:pPr>
-        <w:pStyle w:val="a7"/>
-        <w:rPr>
-          <w:lang w:val="en-US"/>
-        </w:rPr>
-      </w:pPr>
-      <w:bookmarkStart w:id="11" w:name="_Toc228198626"/>
-      <w:r>
-        <w:t xml:space="preserve">Στιγμιότυπο Εκτέλεσης </w:t>
-      </w:r>
-      <w:r>
-        <w:fldChar w:fldCharType="begin"/>
-      </w:r>
-      <w:r>
-        <w:instrText xml:space="preserve"> SEQ Στιγμιότυπο_Εκτέλεσης \* ARABIC </w:instrText>
-      </w:r>
-      <w:r>
-        <w:fldChar w:fldCharType="separate"/>
-      </w:r>
-      <w:r>
-        <w:rPr>
-          <w:noProof/>
-        </w:rPr>
-        <w:t>2</w:t>
-      </w:r>
-      <w:r>
-        <w:fldChar w:fldCharType="end"/>
-      </w:r>
-      <w:r>
-        <w:t xml:space="preserve"> </w:t>
-      </w:r>
-      <w:bookmarkStart w:id="12" w:name="_Toc228198503"/>
-      <w:r>
-        <w:t>Θεσσαλονίκη</w:t>
-      </w:r>
-      <w:bookmarkEnd w:id="11"/>
-      <w:bookmarkEnd w:id="12"/>
-    </w:p>
-    <w:p>
-      <w:pPr>
-        <w:pStyle w:val="a6"/>
-        <w:ind w:firstLine="0"/>
-        <w:rPr>
-          <w:lang w:val="en-US"/>
-        </w:rPr>
-      </w:pPr>
-    </w:p>
-    <w:p>
-      <w:pPr>
         <w:pStyle w:val="a6"/>
         <w:numPr>
           <w:ilvl w:val="0"/>
@@ -14627,6 +14489,42 @@
       <w:r>
         <w:t>" για την έκταση και τον πληθυσμό), επιτρέποντας στο πρόγραμμα να πλοηγείται με ακρίβεια στα σωστά πεδία πληροφοριών βάσει των συμφραζομένων της σελίδας.</w:t>
       </w:r>
+    </w:p>
+    <w:p>
+      <w:pPr>
+        <w:pStyle w:val="a7"/>
+      </w:pPr>
+      <w:bookmarkStart w:id="11" w:name="_Toc228198627"/>
+      <w:r>
+        <w:t xml:space="preserve">Στιγμιότυπο Εκτέλεσης </w:t>
+      </w:r>
+      <w:r>
+        <w:fldChar w:fldCharType="begin"/>
+      </w:r>
+      <w:r>
+        <w:instrText xml:space="preserve"> SEQ Στιγμιότυπο_Εκτέλεσης \* ARABIC </w:instrText>
+      </w:r>
+      <w:r>
+        <w:fldChar w:fldCharType="separate"/>
+      </w:r>
+      <w:r>
+        <w:rPr>
+          <w:noProof/>
+        </w:rPr>
+        <w:t>3</w:t>
+      </w:r>
+      <w:r>
+        <w:fldChar w:fldCharType="end"/>
+      </w:r>
+      <w:r>
+        <w:t xml:space="preserve"> </w:t>
+      </w:r>
+      <w:bookmarkStart w:id="12" w:name="_Toc228198504"/>
+      <w:r>
+        <w:t>Νέα Ιωνία</w:t>
+      </w:r>
+      <w:bookmarkEnd w:id="11"/>
+      <w:bookmarkEnd w:id="12"/>
     </w:p>
     <w:p>
       <w:pPr>
@@ -14678,53 +14576,17 @@
     </w:p>
     <w:p>
       <w:pPr>
-        <w:pStyle w:val="a7"/>
-      </w:pPr>
-      <w:bookmarkStart w:id="13" w:name="_Toc228198627"/>
-      <w:r>
-        <w:t xml:space="preserve">Στιγμιότυπο Εκτέλεσης </w:t>
-      </w:r>
-      <w:r>
-        <w:fldChar w:fldCharType="begin"/>
-      </w:r>
-      <w:r>
-        <w:instrText xml:space="preserve"> SEQ Στιγμιότυπο_Εκτέλεσης \* ARABIC </w:instrText>
-      </w:r>
-      <w:r>
-        <w:fldChar w:fldCharType="separate"/>
-      </w:r>
-      <w:r>
-        <w:rPr>
-          <w:noProof/>
-        </w:rPr>
-        <w:t>3</w:t>
-      </w:r>
-      <w:r>
-        <w:fldChar w:fldCharType="end"/>
-      </w:r>
-      <w:r>
-        <w:t xml:space="preserve"> </w:t>
-      </w:r>
-      <w:bookmarkStart w:id="14" w:name="_Toc228198504"/>
-      <w:r>
-        <w:t>Νέα Ιωνία</w:t>
-      </w:r>
-      <w:bookmarkEnd w:id="13"/>
-      <w:bookmarkEnd w:id="14"/>
-    </w:p>
-    <w:p>
-      <w:pPr>
         <w:pStyle w:val="2"/>
         <w:numPr>
           <w:ilvl w:val="1"/>
           <w:numId w:val="3"/>
         </w:numPr>
       </w:pPr>
-      <w:bookmarkStart w:id="15" w:name="_Toc228197865"/>
+      <w:bookmarkStart w:id="13" w:name="_Toc228197865"/>
       <w:r>
         <w:t>Φάση Ελέγχου</w:t>
       </w:r>
-      <w:bookmarkEnd w:id="15"/>
+      <w:bookmarkEnd w:id="13"/>
     </w:p>
     <w:p>
       <w:r>
@@ -14759,6 +14621,45 @@
     </w:p>
     <w:p>
       <w:pPr>
+        <w:pStyle w:val="a7"/>
+        <w:rPr>
+          <w:lang w:val="en-US"/>
+        </w:rPr>
+      </w:pPr>
+      <w:bookmarkStart w:id="14" w:name="_Toc228198628"/>
+      <w:r>
+        <w:t xml:space="preserve">Στιγμιότυπο Εκτέλεσης </w:t>
+      </w:r>
+      <w:r>
+        <w:fldChar w:fldCharType="begin"/>
+      </w:r>
+      <w:r>
+        <w:instrText xml:space="preserve"> SEQ Στιγμιότυπο_Εκτέλεσης \* ARABIC </w:instrText>
+      </w:r>
+      <w:r>
+        <w:fldChar w:fldCharType="separate"/>
+      </w:r>
+      <w:r>
+        <w:rPr>
+          <w:noProof/>
+        </w:rPr>
+        <w:t>4</w:t>
+      </w:r>
+      <w:r>
+        <w:fldChar w:fldCharType="end"/>
+      </w:r>
+      <w:r>
+        <w:t xml:space="preserve"> </w:t>
+      </w:r>
+      <w:bookmarkStart w:id="15" w:name="_Toc228198505"/>
+      <w:r>
+        <w:t>Λάρισα</w:t>
+      </w:r>
+      <w:bookmarkEnd w:id="14"/>
+      <w:bookmarkEnd w:id="15"/>
+    </w:p>
+    <w:p>
+      <w:pPr>
         <w:pStyle w:val="a6"/>
         <w:keepNext/>
         <w:ind w:firstLine="0"/>
@@ -14769,7 +14670,7 @@
           <w:lang w:eastAsia="el-GR"/>
         </w:rPr>
         <w:drawing>
-          <wp:inline distT="0" distB="0" distL="0" distR="0" wp14:anchorId="501372E7" wp14:editId="152BDEEA">
+          <wp:inline distT="0" distB="0" distL="0" distR="0" wp14:anchorId="3D81F90C" wp14:editId="3E3C1475">
             <wp:extent cx="4747260" cy="1158240"/>
             <wp:effectExtent l="0" t="0" r="0" b="3810"/>
             <wp:docPr id="11" name="Εικόνα 11"/>
@@ -14807,42 +14708,9 @@
     </w:p>
     <w:p>
       <w:pPr>
-        <w:pStyle w:val="a7"/>
-        <w:rPr>
-          <w:lang w:val="en-US"/>
-        </w:rPr>
-      </w:pPr>
-      <w:bookmarkStart w:id="16" w:name="_Toc228198628"/>
-      <w:r>
-        <w:t xml:space="preserve">Στιγμιότυπο Εκτέλεσης </w:t>
-      </w:r>
-      <w:r>
-        <w:fldChar w:fldCharType="begin"/>
-      </w:r>
-      <w:r>
-        <w:instrText xml:space="preserve"> SEQ Στιγμιότυπο_Εκτέλεσης \* ARABIC </w:instrText>
-      </w:r>
-      <w:r>
-        <w:fldChar w:fldCharType="separate"/>
-      </w:r>
-      <w:r>
-        <w:rPr>
-          <w:noProof/>
-        </w:rPr>
-        <w:t>4</w:t>
-      </w:r>
-      <w:r>
-        <w:fldChar w:fldCharType="end"/>
-      </w:r>
-      <w:r>
-        <w:t xml:space="preserve"> </w:t>
-      </w:r>
-      <w:bookmarkStart w:id="17" w:name="_Toc228198505"/>
-      <w:r>
-        <w:t>Λάρισα</w:t>
-      </w:r>
-      <w:bookmarkEnd w:id="16"/>
-      <w:bookmarkEnd w:id="17"/>
+        <w:keepNext/>
+        <w:ind w:firstLine="0"/>
+      </w:pPr>
     </w:p>
     <w:p>
       <w:pPr>
@@ -14870,6 +14738,45 @@
         </w:rPr>
         <w:t xml:space="preserve"> (χωρίς πίνακα θερμοκρασίας)</w:t>
       </w:r>
+      <w:bookmarkStart w:id="16" w:name="_Toc228198629"/>
+    </w:p>
+    <w:p>
+      <w:pPr>
+        <w:pStyle w:val="a7"/>
+        <w:rPr>
+          <w:lang w:val="en-US"/>
+        </w:rPr>
+      </w:pPr>
+      <w:r>
+        <w:t xml:space="preserve">Στιγμιότυπο Εκτέλεσης </w:t>
+      </w:r>
+      <w:r>
+        <w:fldChar w:fldCharType="begin"/>
+      </w:r>
+      <w:r>
+        <w:instrText xml:space="preserve"> SEQ Στιγμιότυπο_Εκτέλεσης \* ARABIC </w:instrText>
+      </w:r>
+      <w:r>
+        <w:fldChar w:fldCharType="separate"/>
+      </w:r>
+      <w:r>
+        <w:rPr>
+          <w:noProof/>
+        </w:rPr>
+        <w:t>5</w:t>
+      </w:r>
+      <w:r>
+        <w:fldChar w:fldCharType="end"/>
+      </w:r>
+      <w:r>
+        <w:t xml:space="preserve"> </w:t>
+      </w:r>
+      <w:bookmarkStart w:id="17" w:name="_Toc228198506"/>
+      <w:r>
+        <w:t>Τρίκαλα</w:t>
+      </w:r>
+      <w:bookmarkEnd w:id="16"/>
+      <w:bookmarkEnd w:id="17"/>
     </w:p>
     <w:p>
       <w:pPr>
@@ -14922,45 +14829,6 @@
     </w:p>
     <w:p>
       <w:pPr>
-        <w:pStyle w:val="a7"/>
-        <w:rPr>
-          <w:lang w:val="en-US"/>
-        </w:rPr>
-      </w:pPr>
-      <w:bookmarkStart w:id="18" w:name="_Toc228198629"/>
-      <w:r>
-        <w:t xml:space="preserve">Στιγμιότυπο Εκτέλεσης </w:t>
-      </w:r>
-      <w:r>
-        <w:fldChar w:fldCharType="begin"/>
-      </w:r>
-      <w:r>
-        <w:instrText xml:space="preserve"> SEQ Στιγμιότυπο_Εκτέλεσης \* ARABIC </w:instrText>
-      </w:r>
-      <w:r>
-        <w:fldChar w:fldCharType="separate"/>
-      </w:r>
-      <w:r>
-        <w:rPr>
-          <w:noProof/>
-        </w:rPr>
-        <w:t>5</w:t>
-      </w:r>
-      <w:r>
-        <w:fldChar w:fldCharType="end"/>
-      </w:r>
-      <w:r>
-        <w:t xml:space="preserve"> </w:t>
-      </w:r>
-      <w:bookmarkStart w:id="19" w:name="_Toc228198506"/>
-      <w:r>
-        <w:t>Τρίκαλα</w:t>
-      </w:r>
-      <w:bookmarkEnd w:id="18"/>
-      <w:bookmarkEnd w:id="19"/>
-    </w:p>
-    <w:p>
-      <w:pPr>
         <w:pStyle w:val="a6"/>
         <w:numPr>
           <w:ilvl w:val="0"/>
@@ -14988,6 +14856,42 @@
     </w:p>
     <w:p>
       <w:pPr>
+        <w:pStyle w:val="a7"/>
+      </w:pPr>
+      <w:bookmarkStart w:id="18" w:name="_Toc228198630"/>
+      <w:r>
+        <w:t xml:space="preserve">Στιγμιότυπο Εκτέλεσης </w:t>
+      </w:r>
+      <w:r>
+        <w:fldChar w:fldCharType="begin"/>
+      </w:r>
+      <w:r>
+        <w:instrText xml:space="preserve"> SEQ Στιγμιότυπο_Εκτέλεσης \* ARABIC </w:instrText>
+      </w:r>
+      <w:r>
+        <w:fldChar w:fldCharType="separate"/>
+      </w:r>
+      <w:r>
+        <w:rPr>
+          <w:noProof/>
+        </w:rPr>
+        <w:t>6</w:t>
+      </w:r>
+      <w:r>
+        <w:fldChar w:fldCharType="end"/>
+      </w:r>
+      <w:r>
+        <w:t xml:space="preserve"> </w:t>
+      </w:r>
+      <w:bookmarkStart w:id="19" w:name="_Toc228198507"/>
+      <w:r>
+        <w:t>Καρδίτσα</w:t>
+      </w:r>
+      <w:bookmarkEnd w:id="18"/>
+      <w:bookmarkEnd w:id="19"/>
+    </w:p>
+    <w:p>
+      <w:pPr>
         <w:keepNext/>
       </w:pPr>
       <w:r>
@@ -14996,7 +14900,7 @@
           <w:lang w:eastAsia="el-GR"/>
         </w:rPr>
         <w:drawing>
-          <wp:inline distT="0" distB="0" distL="0" distR="0" wp14:anchorId="35FA4CAF" wp14:editId="5E5CB40F">
+          <wp:inline distT="0" distB="0" distL="0" distR="0" wp14:anchorId="21182A07" wp14:editId="371117D3">
             <wp:extent cx="3048000" cy="1188720"/>
             <wp:effectExtent l="0" t="0" r="0" b="0"/>
             <wp:docPr id="13" name="Εικόνα 13"/>
@@ -15034,49 +14938,6 @@
     </w:p>
     <w:p>
       <w:pPr>
-        <w:pStyle w:val="a7"/>
-      </w:pPr>
-      <w:bookmarkStart w:id="20" w:name="_Toc228198630"/>
-      <w:r>
-        <w:t xml:space="preserve">Στιγμιότυπο Εκτέλεσης </w:t>
-      </w:r>
-      <w:r>
-        <w:fldChar w:fldCharType="begin"/>
-      </w:r>
-      <w:r>
-        <w:instrText xml:space="preserve"> SEQ Στιγμιότυπο_Εκτέλεσης \* ARABIC </w:instrText>
-      </w:r>
-      <w:r>
-        <w:fldChar w:fldCharType="separate"/>
-      </w:r>
-      <w:r>
-        <w:rPr>
-          <w:noProof/>
-        </w:rPr>
-        <w:t>6</w:t>
-      </w:r>
-      <w:r>
-        <w:fldChar w:fldCharType="end"/>
-      </w:r>
-      <w:r>
-        <w:t xml:space="preserve"> </w:t>
-      </w:r>
-      <w:bookmarkStart w:id="21" w:name="_Toc228198507"/>
-      <w:r>
-        <w:t>Καρδίτσα</w:t>
-      </w:r>
-      <w:bookmarkEnd w:id="20"/>
-      <w:bookmarkEnd w:id="21"/>
-    </w:p>
-    <w:p>
-      <w:pPr>
-        <w:rPr>
-          <w:lang w:val="en-US"/>
-        </w:rPr>
-      </w:pPr>
-    </w:p>
-    <w:p>
-      <w:pPr>
         <w:pStyle w:val="a6"/>
         <w:numPr>
           <w:ilvl w:val="0"/>
@@ -15101,6 +14962,42 @@
         </w:rPr>
         <w:t xml:space="preserve"> (με πίνακα θερμοκρασίας)</w:t>
       </w:r>
+    </w:p>
+    <w:p>
+      <w:pPr>
+        <w:pStyle w:val="a7"/>
+      </w:pPr>
+      <w:bookmarkStart w:id="20" w:name="_Toc228198631"/>
+      <w:r>
+        <w:t xml:space="preserve">Στιγμιότυπο Εκτέλεσης </w:t>
+      </w:r>
+      <w:r>
+        <w:fldChar w:fldCharType="begin"/>
+      </w:r>
+      <w:r>
+        <w:instrText xml:space="preserve"> SEQ Στιγμιότυπο_Εκτέλεσης \* ARABIC </w:instrText>
+      </w:r>
+      <w:r>
+        <w:fldChar w:fldCharType="separate"/>
+      </w:r>
+      <w:r>
+        <w:rPr>
+          <w:noProof/>
+        </w:rPr>
+        <w:t>7</w:t>
+      </w:r>
+      <w:r>
+        <w:fldChar w:fldCharType="end"/>
+      </w:r>
+      <w:r>
+        <w:t xml:space="preserve"> </w:t>
+      </w:r>
+      <w:bookmarkStart w:id="21" w:name="_Toc228198508"/>
+      <w:r>
+        <w:t>Πάτρα</w:t>
+      </w:r>
+      <w:bookmarkEnd w:id="20"/>
+      <w:bookmarkEnd w:id="21"/>
     </w:p>
     <w:p>
       <w:pPr>
@@ -15152,42 +15049,6 @@
     </w:p>
     <w:p>
       <w:pPr>
-        <w:pStyle w:val="a7"/>
-      </w:pPr>
-      <w:bookmarkStart w:id="22" w:name="_Toc228198631"/>
-      <w:r>
-        <w:t xml:space="preserve">Στιγμιότυπο Εκτέλεσης </w:t>
-      </w:r>
-      <w:r>
-        <w:fldChar w:fldCharType="begin"/>
-      </w:r>
-      <w:r>
-        <w:instrText xml:space="preserve"> SEQ Στιγμιότυπο_Εκτέλεσης \* ARABIC </w:instrText>
-      </w:r>
-      <w:r>
-        <w:fldChar w:fldCharType="separate"/>
-      </w:r>
-      <w:r>
-        <w:rPr>
-          <w:noProof/>
-        </w:rPr>
-        <w:t>7</w:t>
-      </w:r>
-      <w:r>
-        <w:fldChar w:fldCharType="end"/>
-      </w:r>
-      <w:r>
-        <w:t xml:space="preserve"> </w:t>
-      </w:r>
-      <w:bookmarkStart w:id="23" w:name="_Toc228198508"/>
-      <w:r>
-        <w:t>Πάτρα</w:t>
-      </w:r>
-      <w:bookmarkEnd w:id="22"/>
-      <w:bookmarkEnd w:id="23"/>
-    </w:p>
-    <w:p>
-      <w:pPr>
         <w:pStyle w:val="a6"/>
         <w:numPr>
           <w:ilvl w:val="0"/>
@@ -15212,6 +15073,45 @@
         </w:rPr>
         <w:t xml:space="preserve"> (χωρίς πίνακα θερμοκρασίας)</w:t>
       </w:r>
+    </w:p>
+    <w:p>
+      <w:pPr>
+        <w:pStyle w:val="a7"/>
+        <w:rPr>
+          <w:lang w:val="en-US"/>
+        </w:rPr>
+      </w:pPr>
+      <w:bookmarkStart w:id="22" w:name="_Toc228198632"/>
+      <w:r>
+        <w:t xml:space="preserve">Στιγμιότυπο Εκτέλεσης </w:t>
+      </w:r>
+      <w:r>
+        <w:fldChar w:fldCharType="begin"/>
+      </w:r>
+      <w:r>
+        <w:instrText xml:space="preserve"> SEQ Στιγμιότυπο_Εκτέλεσης \* ARABIC </w:instrText>
+      </w:r>
+      <w:r>
+        <w:fldChar w:fldCharType="separate"/>
+      </w:r>
+      <w:r>
+        <w:rPr>
+          <w:noProof/>
+        </w:rPr>
+        <w:t>8</w:t>
+      </w:r>
+      <w:r>
+        <w:fldChar w:fldCharType="end"/>
+      </w:r>
+      <w:r>
+        <w:t xml:space="preserve"> </w:t>
+      </w:r>
+      <w:bookmarkStart w:id="23" w:name="_Toc228198509"/>
+      <w:r>
+        <w:t>Ιωάννινα</w:t>
+      </w:r>
+      <w:bookmarkEnd w:id="22"/>
+      <w:bookmarkEnd w:id="23"/>
     </w:p>
     <w:p>
       <w:pPr>
@@ -15263,45 +15163,6 @@
     </w:p>
     <w:p>
       <w:pPr>
-        <w:pStyle w:val="a7"/>
-        <w:rPr>
-          <w:lang w:val="en-US"/>
-        </w:rPr>
-      </w:pPr>
-      <w:bookmarkStart w:id="24" w:name="_Toc228198632"/>
-      <w:r>
-        <w:t xml:space="preserve">Στιγμιότυπο Εκτέλεσης </w:t>
-      </w:r>
-      <w:r>
-        <w:fldChar w:fldCharType="begin"/>
-      </w:r>
-      <w:r>
-        <w:instrText xml:space="preserve"> SEQ Στιγμιότυπο_Εκτέλεσης \* ARABIC </w:instrText>
-      </w:r>
-      <w:r>
-        <w:fldChar w:fldCharType="separate"/>
-      </w:r>
-      <w:r>
-        <w:rPr>
-          <w:noProof/>
-        </w:rPr>
-        <w:t>8</w:t>
-      </w:r>
-      <w:r>
-        <w:fldChar w:fldCharType="end"/>
-      </w:r>
-      <w:r>
-        <w:t xml:space="preserve"> </w:t>
-      </w:r>
-      <w:bookmarkStart w:id="25" w:name="_Toc228198509"/>
-      <w:r>
-        <w:t>Ιωάννινα</w:t>
-      </w:r>
-      <w:bookmarkEnd w:id="24"/>
-      <w:bookmarkEnd w:id="25"/>
-    </w:p>
-    <w:p>
-      <w:pPr>
         <w:pStyle w:val="a6"/>
         <w:numPr>
           <w:ilvl w:val="0"/>
@@ -15329,19 +15190,56 @@
     </w:p>
     <w:p>
       <w:pPr>
+        <w:pStyle w:val="a7"/>
+      </w:pPr>
+      <w:bookmarkStart w:id="24" w:name="_Toc228198633"/>
+      <w:r>
+        <w:t xml:space="preserve">Στιγμιότυπο Εκτέλεσης </w:t>
+      </w:r>
+      <w:r>
+        <w:fldChar w:fldCharType="begin"/>
+      </w:r>
+      <w:r>
+        <w:instrText xml:space="preserve"> SEQ Στιγμιότυπο_Εκτέλεσης \* ARABIC </w:instrText>
+      </w:r>
+      <w:r>
+        <w:fldChar w:fldCharType="separate"/>
+      </w:r>
+      <w:r>
+        <w:rPr>
+          <w:noProof/>
+        </w:rPr>
+        <w:t>9</w:t>
+      </w:r>
+      <w:r>
+        <w:fldChar w:fldCharType="end"/>
+      </w:r>
+      <w:r>
+        <w:t xml:space="preserve"> </w:t>
+      </w:r>
+      <w:bookmarkStart w:id="25" w:name="_Toc228198510"/>
+      <w:r>
+        <w:t>Χανιά</w:t>
+      </w:r>
+      <w:bookmarkEnd w:id="24"/>
+      <w:bookmarkEnd w:id="25"/>
+    </w:p>
+    <w:p>
+      <w:pPr>
         <w:pStyle w:val="a6"/>
         <w:keepNext/>
         <w:ind w:firstLine="0"/>
       </w:pPr>
+      <w:bookmarkStart w:id="26" w:name="_GoBack"/>
       <w:r>
         <w:rPr>
           <w:noProof/>
           <w:lang w:eastAsia="el-GR"/>
         </w:rPr>
         <w:drawing>
-          <wp:inline distT="0" distB="0" distL="0" distR="0" wp14:anchorId="76CC71F3" wp14:editId="1C3C5F21">
-            <wp:extent cx="3009900" cy="1181100"/>
-            <wp:effectExtent l="0" t="0" r="0" b="0"/>
+          <wp:inline distT="0" distB="0" distL="0" distR="0" wp14:anchorId="0A051ED8" wp14:editId="017CF6D3">
+            <wp:extent cx="1995055" cy="782869"/>
+            <wp:effectExtent l="0" t="0" r="5715" b="0"/>
             <wp:docPr id="16" name="Εικόνα 16"/>
             <wp:cNvGraphicFramePr>
               <a:graphicFrameLocks xmlns:a="http://schemas.openxmlformats.org/drawingml/2006/main" noChangeAspect="1"/>
@@ -15362,7 +15260,7 @@
                   <pic:spPr>
                     <a:xfrm>
                       <a:off x="0" y="0"/>
-                      <a:ext cx="3009900" cy="1181100"/>
+                      <a:ext cx="1995055" cy="782869"/>
                     </a:xfrm>
                     <a:prstGeom prst="rect">
                       <a:avLst/>
@@ -15374,42 +15272,7 @@
           </wp:inline>
         </w:drawing>
       </w:r>
-    </w:p>
-    <w:p>
-      <w:pPr>
-        <w:pStyle w:val="a7"/>
-      </w:pPr>
-      <w:bookmarkStart w:id="26" w:name="_Toc228198633"/>
-      <w:r>
-        <w:t xml:space="preserve">Στιγμιότυπο Εκτέλεσης </w:t>
-      </w:r>
-      <w:r>
-        <w:fldChar w:fldCharType="begin"/>
-      </w:r>
-      <w:r>
-        <w:instrText xml:space="preserve"> SEQ Στιγμιότυπο_Εκτέλεσης \* ARABIC </w:instrText>
-      </w:r>
-      <w:r>
-        <w:fldChar w:fldCharType="separate"/>
-      </w:r>
-      <w:r>
-        <w:rPr>
-          <w:noProof/>
-        </w:rPr>
-        <w:t>9</w:t>
-      </w:r>
-      <w:r>
-        <w:fldChar w:fldCharType="end"/>
-      </w:r>
-      <w:r>
-        <w:t xml:space="preserve"> </w:t>
-      </w:r>
-      <w:bookmarkStart w:id="27" w:name="_Toc228198510"/>
-      <w:r>
-        <w:t>Χανιά</w:t>
-      </w:r>
       <w:bookmarkEnd w:id="26"/>
-      <w:bookmarkEnd w:id="27"/>
     </w:p>
     <w:p>
       <w:pPr>
@@ -15419,19 +15282,15 @@
           <w:numId w:val="3"/>
         </w:numPr>
       </w:pPr>
-      <w:bookmarkStart w:id="28" w:name="_Toc228197866"/>
-      <w:r>
-        <w:lastRenderedPageBreak/>
+      <w:bookmarkStart w:id="27" w:name="_Toc228197866"/>
+      <w:r>
         <w:t>Φάση Αξιολόγησης</w:t>
       </w:r>
-      <w:bookmarkEnd w:id="28"/>
+      <w:bookmarkEnd w:id="27"/>
     </w:p>
     <w:p>
       <w:pPr>
         <w:jc w:val="left"/>
-        <w:rPr>
-          <w:lang w:val="en-US"/>
-        </w:rPr>
       </w:pPr>
       <w:r>
         <w:t xml:space="preserve">Από </w:t>
@@ -15455,6 +15314,7 @@
         <w:t xml:space="preserve"> </w:t>
       </w:r>
       <w:r>
+        <w:lastRenderedPageBreak/>
         <w:t>Συντεταγμένες, Υψόμετρο,</w:t>
       </w:r>
       <w:r>
@@ -17750,7 +17610,7 @@
 </file>
 
 <file path=customXml/itemProps1.xml><?xml version="1.0" encoding="utf-8"?>
-<ds:datastoreItem xmlns:ds="http://schemas.openxmlformats.org/officeDocument/2006/customXml" ds:itemID="{37EF6CA9-686B-4C4D-84F7-278477F05C78}">
+<ds:datastoreItem xmlns:ds="http://schemas.openxmlformats.org/officeDocument/2006/customXml" ds:itemID="{5C4C00EE-C163-4B13-B407-CCCA04D3B5B9}">
   <ds:schemaRefs>
     <ds:schemaRef ds:uri="http://schemas.openxmlformats.org/officeDocument/2006/bibliography"/>
   </ds:schemaRefs>

</xml_diff>